<commit_message>
Update Migration Watch Word template
</commit_message>
<xml_diff>
--- a/plugins/lexvia-legal/skills/australia-migration-watch/references/logo template.docx
+++ b/plugins/lexvia-legal/skills/australia-migration-watch/references/logo template.docx
@@ -1,28 +1,17 @@
 
 <file path=word/document.xml><?xml version="1.0" encoding="utf-8"?>
-<w:document xmlns:wpc="http://schemas.microsoft.com/office/word/2010/wordprocessingCanvas" xmlns:cx="http://schemas.microsoft.com/office/drawing/2014/chartex" xmlns:cx1="http://schemas.microsoft.com/office/drawing/2015/9/8/chartex" xmlns:cx2="http://schemas.microsoft.com/office/drawing/2015/10/21/chartex" xmlns:cx3="http://schemas.microsoft.com/office/drawing/2016/5/9/chartex" xmlns:cx4="http://schemas.microsoft.com/office/drawing/2016/5/10/chartex" xmlns:cx5="http://schemas.microsoft.com/office/drawing/2016/5/11/chartex" xmlns:cx6="http://schemas.microsoft.com/office/drawing/2016/5/12/chartex" xmlns:cx7="http://schemas.microsoft.com/office/drawing/2016/5/13/chartex" xmlns:cx8="http://schemas.microsoft.com/office/drawing/2016/5/14/chartex" xmlns:mc="http://schemas.openxmlformats.org/markup-compatibility/2006" xmlns:aink="http://schemas.microsoft.com/office/drawing/2016/ink" xmlns:am3d="http://schemas.microsoft.com/office/drawing/2017/model3d" xmlns:o="urn:schemas-microsoft-com:office:office" xmlns:oel="http://schemas.microsoft.com/office/2019/extlst" xmlns:r="http://schemas.openxmlformats.org/officeDocument/2006/relationships" xmlns:m="http://schemas.openxmlformats.org/officeDocument/2006/math" xmlns:v="urn:schemas-microsoft-com:vml" xmlns:wp14="http://schemas.microsoft.com/office/word/2010/wordprocessingDrawing" xmlns:wp="http://schemas.openxmlformats.org/drawingml/2006/wordprocessingDrawing" xmlns:w10="urn:schemas-microsoft-com:office:word" xmlns:w="http://schemas.openxmlformats.org/wordprocessingml/2006/main" xmlns:w14="http://schemas.microsoft.com/office/word/2010/wordml" xmlns:w15="http://schemas.microsoft.com/office/word/2012/wordml" xmlns:w16cex="http://schemas.microsoft.com/office/word/2018/wordml/cex" xmlns:w16cid="http://schemas.microsoft.com/office/word/2016/wordml/cid" xmlns:w16="http://schemas.microsoft.com/office/word/2018/wordml" xmlns:w16du="http://schemas.microsoft.com/office/word/2023/wordml/word16du" xmlns:w16sdtdh="http://schemas.microsoft.com/office/word/2020/wordml/sdtdatahash" xmlns:w16sdtfl="http://schemas.microsoft.com/office/word/2024/wordml/sdtformatlock" xmlns:w16se="http://schemas.microsoft.com/office/word/2015/wordml/symex" xmlns:wpg="http://schemas.microsoft.com/office/word/2010/wordprocessingGroup" xmlns:wpi="http://schemas.microsoft.com/office/word/2010/wordprocessingInk" xmlns:wne="http://schemas.microsoft.com/office/word/2006/wordml" xmlns:wps="http://schemas.microsoft.com/office/word/2010/wordprocessingShape" mc:Ignorable="w14 w15 w16se w16cid w16 w16cex w16sdtdh w16sdtfl w16du wp14">
+<w:document xmlns:wpc="http://schemas.microsoft.com/office/word/2010/wordprocessingCanvas" xmlns:cx="http://schemas.microsoft.com/office/drawing/2014/chartex" xmlns:cx1="http://schemas.microsoft.com/office/drawing/2015/9/8/chartex" xmlns:cx2="http://schemas.microsoft.com/office/drawing/2015/10/21/chartex" xmlns:cx3="http://schemas.microsoft.com/office/drawing/2016/5/9/chartex" xmlns:cx4="http://schemas.microsoft.com/office/drawing/2016/5/10/chartex" xmlns:cx5="http://schemas.microsoft.com/office/drawing/2016/5/11/chartex" xmlns:cx6="http://schemas.microsoft.com/office/drawing/2016/5/12/chartex" xmlns:cx7="http://schemas.microsoft.com/office/drawing/2016/5/13/chartex" xmlns:cx8="http://schemas.microsoft.com/office/drawing/2016/5/14/chartex" xmlns:mc="http://schemas.openxmlformats.org/markup-compatibility/2006" xmlns:aink="http://schemas.microsoft.com/office/drawing/2016/ink" xmlns:am3d="http://schemas.microsoft.com/office/drawing/2017/model3d" xmlns:o="urn:schemas-microsoft-com:office:office" xmlns:oel="http://schemas.microsoft.com/office/2019/extlst" xmlns:r="http://schemas.openxmlformats.org/officeDocument/2006/relationships" xmlns:m="http://schemas.openxmlformats.org/officeDocument/2006/math" xmlns:v="urn:schemas-microsoft-com:vml" xmlns:wp14="http://schemas.microsoft.com/office/word/2010/wordprocessingDrawing" xmlns:wp="http://schemas.openxmlformats.org/drawingml/2006/wordprocessingDrawing" xmlns:w10="urn:schemas-microsoft-com:office:word" xmlns:w="http://schemas.openxmlformats.org/wordprocessingml/2006/main" xmlns:w14="http://schemas.microsoft.com/office/word/2010/wordml" xmlns:w15="http://schemas.microsoft.com/office/word/2012/wordml" xmlns:w16cei="http://schemas.microsoft.com/office/word/2026/wordml/cei" xmlns:w16cex="http://schemas.microsoft.com/office/word/2018/wordml/cex" xmlns:w16cid="http://schemas.microsoft.com/office/word/2016/wordml/cid" xmlns:w16="http://schemas.microsoft.com/office/word/2018/wordml" xmlns:w16du="http://schemas.microsoft.com/office/word/2023/wordml/word16du" xmlns:w16sdtdh="http://schemas.microsoft.com/office/word/2020/wordml/sdtdatahash" xmlns:w16sdtfl="http://schemas.microsoft.com/office/word/2024/wordml/sdtformatlock" xmlns:w16se="http://schemas.microsoft.com/office/word/2015/wordml/symex" xmlns:wpg="http://schemas.microsoft.com/office/word/2010/wordprocessingGroup" xmlns:wpi="http://schemas.microsoft.com/office/word/2010/wordprocessingInk" xmlns:wne="http://schemas.microsoft.com/office/word/2006/wordml" xmlns:wps="http://schemas.microsoft.com/office/word/2010/wordprocessingShape" mc:Ignorable="w14 w15 w16se w16cid w16 w16cex w16sdtdh w16sdtfl w16du wp14">
   <w:body>
-    <w:p>
-      <w:pPr>
-        <w:pStyle w:val="a9"/>
-        <w:spacing w:after="80" w:line="200" w:lineRule="exact"/>
-        <w:ind w:left="360"/>
-        <w:rPr>
-          <w:rFonts w:ascii="思源黑体" w:eastAsia="思源黑体" w:hAnsi="思源黑体"/>
-          <w:sz w:val="16"/>
-          <w:szCs w:val="16"/>
-        </w:rPr>
-      </w:pPr>
-    </w:p>
+    <w:p/>
     <w:sectPr>
-      <w:headerReference w:type="even" r:id="rId7"/>
-      <w:headerReference w:type="default" r:id="rId8"/>
-      <w:footerReference w:type="even" r:id="rId9"/>
-      <w:footerReference w:type="default" r:id="rId10"/>
-      <w:headerReference w:type="first" r:id="rId11"/>
-      <w:footerReference w:type="first" r:id="rId12"/>
+      <w:headerReference w:type="even" r:id="rId9"/>
+      <w:headerReference w:type="default" r:id="rId10"/>
+      <w:footerReference w:type="even" r:id="rId11"/>
+      <w:footerReference w:type="default" r:id="rId12"/>
+      <w:headerReference w:type="first" r:id="rId13"/>
+      <w:footerReference w:type="first" r:id="rId14"/>
       <w:pgSz w:w="11906" w:h="16838"/>
-      <w:pgMar w:top="2835" w:right="1797" w:bottom="1985" w:left="1418" w:header="851" w:footer="992" w:gutter="0"/>
+      <w:pgMar w:top="3686" w:right="1418" w:bottom="1758" w:left="1418" w:header="851" w:footer="992" w:gutter="0"/>
       <w:cols w:space="425"/>
       <w:docGrid w:type="lines" w:linePitch="312"/>
     </w:sectPr>
@@ -31,7 +20,7 @@
 </file>
 
 <file path=word/endnotes.xml><?xml version="1.0" encoding="utf-8"?>
-<w:endnotes xmlns:wpc="http://schemas.microsoft.com/office/word/2010/wordprocessingCanvas" xmlns:cx="http://schemas.microsoft.com/office/drawing/2014/chartex" xmlns:cx1="http://schemas.microsoft.com/office/drawing/2015/9/8/chartex" xmlns:cx2="http://schemas.microsoft.com/office/drawing/2015/10/21/chartex" xmlns:cx3="http://schemas.microsoft.com/office/drawing/2016/5/9/chartex" xmlns:cx4="http://schemas.microsoft.com/office/drawing/2016/5/10/chartex" xmlns:cx5="http://schemas.microsoft.com/office/drawing/2016/5/11/chartex" xmlns:cx6="http://schemas.microsoft.com/office/drawing/2016/5/12/chartex" xmlns:cx7="http://schemas.microsoft.com/office/drawing/2016/5/13/chartex" xmlns:cx8="http://schemas.microsoft.com/office/drawing/2016/5/14/chartex" xmlns:mc="http://schemas.openxmlformats.org/markup-compatibility/2006" xmlns:aink="http://schemas.microsoft.com/office/drawing/2016/ink" xmlns:am3d="http://schemas.microsoft.com/office/drawing/2017/model3d" xmlns:o="urn:schemas-microsoft-com:office:office" xmlns:oel="http://schemas.microsoft.com/office/2019/extlst" xmlns:r="http://schemas.openxmlformats.org/officeDocument/2006/relationships" xmlns:m="http://schemas.openxmlformats.org/officeDocument/2006/math" xmlns:v="urn:schemas-microsoft-com:vml" xmlns:wp14="http://schemas.microsoft.com/office/word/2010/wordprocessingDrawing" xmlns:wp="http://schemas.openxmlformats.org/drawingml/2006/wordprocessingDrawing" xmlns:w10="urn:schemas-microsoft-com:office:word" xmlns:w="http://schemas.openxmlformats.org/wordprocessingml/2006/main" xmlns:w14="http://schemas.microsoft.com/office/word/2010/wordml" xmlns:w15="http://schemas.microsoft.com/office/word/2012/wordml" xmlns:w16cex="http://schemas.microsoft.com/office/word/2018/wordml/cex" xmlns:w16cid="http://schemas.microsoft.com/office/word/2016/wordml/cid" xmlns:w16="http://schemas.microsoft.com/office/word/2018/wordml" xmlns:w16du="http://schemas.microsoft.com/office/word/2023/wordml/word16du" xmlns:w16sdtdh="http://schemas.microsoft.com/office/word/2020/wordml/sdtdatahash" xmlns:w16sdtfl="http://schemas.microsoft.com/office/word/2024/wordml/sdtformatlock" xmlns:w16se="http://schemas.microsoft.com/office/word/2015/wordml/symex" xmlns:wpg="http://schemas.microsoft.com/office/word/2010/wordprocessingGroup" xmlns:wpi="http://schemas.microsoft.com/office/word/2010/wordprocessingInk" xmlns:wne="http://schemas.microsoft.com/office/word/2006/wordml" xmlns:wps="http://schemas.microsoft.com/office/word/2010/wordprocessingShape" mc:Ignorable="w14 w15 w16se w16cid w16 w16cex w16sdtdh w16sdtfl w16du wp14">
+<w:endnotes xmlns:wpc="http://schemas.microsoft.com/office/word/2010/wordprocessingCanvas" xmlns:cx="http://schemas.microsoft.com/office/drawing/2014/chartex" xmlns:cx1="http://schemas.microsoft.com/office/drawing/2015/9/8/chartex" xmlns:cx2="http://schemas.microsoft.com/office/drawing/2015/10/21/chartex" xmlns:cx3="http://schemas.microsoft.com/office/drawing/2016/5/9/chartex" xmlns:cx4="http://schemas.microsoft.com/office/drawing/2016/5/10/chartex" xmlns:cx5="http://schemas.microsoft.com/office/drawing/2016/5/11/chartex" xmlns:cx6="http://schemas.microsoft.com/office/drawing/2016/5/12/chartex" xmlns:cx7="http://schemas.microsoft.com/office/drawing/2016/5/13/chartex" xmlns:cx8="http://schemas.microsoft.com/office/drawing/2016/5/14/chartex" xmlns:mc="http://schemas.openxmlformats.org/markup-compatibility/2006" xmlns:aink="http://schemas.microsoft.com/office/drawing/2016/ink" xmlns:am3d="http://schemas.microsoft.com/office/drawing/2017/model3d" xmlns:o="urn:schemas-microsoft-com:office:office" xmlns:oel="http://schemas.microsoft.com/office/2019/extlst" xmlns:r="http://schemas.openxmlformats.org/officeDocument/2006/relationships" xmlns:m="http://schemas.openxmlformats.org/officeDocument/2006/math" xmlns:v="urn:schemas-microsoft-com:vml" xmlns:wp14="http://schemas.microsoft.com/office/word/2010/wordprocessingDrawing" xmlns:wp="http://schemas.openxmlformats.org/drawingml/2006/wordprocessingDrawing" xmlns:w10="urn:schemas-microsoft-com:office:word" xmlns:w="http://schemas.openxmlformats.org/wordprocessingml/2006/main" xmlns:w14="http://schemas.microsoft.com/office/word/2010/wordml" xmlns:w15="http://schemas.microsoft.com/office/word/2012/wordml" xmlns:w16cei="http://schemas.microsoft.com/office/word/2026/wordml/cei" xmlns:w16cex="http://schemas.microsoft.com/office/word/2018/wordml/cex" xmlns:w16cid="http://schemas.microsoft.com/office/word/2016/wordml/cid" xmlns:w16="http://schemas.microsoft.com/office/word/2018/wordml" xmlns:w16du="http://schemas.microsoft.com/office/word/2023/wordml/word16du" xmlns:w16sdtdh="http://schemas.microsoft.com/office/word/2020/wordml/sdtdatahash" xmlns:w16sdtfl="http://schemas.microsoft.com/office/word/2024/wordml/sdtformatlock" xmlns:w16se="http://schemas.microsoft.com/office/word/2015/wordml/symex" xmlns:wpg="http://schemas.microsoft.com/office/word/2010/wordprocessingGroup" xmlns:wpi="http://schemas.microsoft.com/office/word/2010/wordprocessingInk" xmlns:wne="http://schemas.microsoft.com/office/word/2006/wordml" xmlns:wps="http://schemas.microsoft.com/office/word/2010/wordprocessingShape" mc:Ignorable="w14 w15 w16se w16cid w16 w16cex w16sdtdh w16sdtfl w16du wp14">
   <w:endnote w:type="separator" w:id="-1">
     <w:p>
       <w:pPr>
@@ -56,7 +45,7 @@
 </file>
 
 <file path=word/footer1.xml><?xml version="1.0" encoding="utf-8"?>
-<w:ftr xmlns:wpc="http://schemas.microsoft.com/office/word/2010/wordprocessingCanvas" xmlns:cx="http://schemas.microsoft.com/office/drawing/2014/chartex" xmlns:cx1="http://schemas.microsoft.com/office/drawing/2015/9/8/chartex" xmlns:cx2="http://schemas.microsoft.com/office/drawing/2015/10/21/chartex" xmlns:cx3="http://schemas.microsoft.com/office/drawing/2016/5/9/chartex" xmlns:cx4="http://schemas.microsoft.com/office/drawing/2016/5/10/chartex" xmlns:cx5="http://schemas.microsoft.com/office/drawing/2016/5/11/chartex" xmlns:cx6="http://schemas.microsoft.com/office/drawing/2016/5/12/chartex" xmlns:cx7="http://schemas.microsoft.com/office/drawing/2016/5/13/chartex" xmlns:cx8="http://schemas.microsoft.com/office/drawing/2016/5/14/chartex" xmlns:mc="http://schemas.openxmlformats.org/markup-compatibility/2006" xmlns:aink="http://schemas.microsoft.com/office/drawing/2016/ink" xmlns:am3d="http://schemas.microsoft.com/office/drawing/2017/model3d" xmlns:o="urn:schemas-microsoft-com:office:office" xmlns:oel="http://schemas.microsoft.com/office/2019/extlst" xmlns:r="http://schemas.openxmlformats.org/officeDocument/2006/relationships" xmlns:m="http://schemas.openxmlformats.org/officeDocument/2006/math" xmlns:v="urn:schemas-microsoft-com:vml" xmlns:wp14="http://schemas.microsoft.com/office/word/2010/wordprocessingDrawing" xmlns:wp="http://schemas.openxmlformats.org/drawingml/2006/wordprocessingDrawing" xmlns:w10="urn:schemas-microsoft-com:office:word" xmlns:w="http://schemas.openxmlformats.org/wordprocessingml/2006/main" xmlns:w14="http://schemas.microsoft.com/office/word/2010/wordml" xmlns:w15="http://schemas.microsoft.com/office/word/2012/wordml" xmlns:w16cex="http://schemas.microsoft.com/office/word/2018/wordml/cex" xmlns:w16cid="http://schemas.microsoft.com/office/word/2016/wordml/cid" xmlns:w16="http://schemas.microsoft.com/office/word/2018/wordml" xmlns:w16du="http://schemas.microsoft.com/office/word/2023/wordml/word16du" xmlns:w16sdtdh="http://schemas.microsoft.com/office/word/2020/wordml/sdtdatahash" xmlns:w16sdtfl="http://schemas.microsoft.com/office/word/2024/wordml/sdtformatlock" xmlns:w16se="http://schemas.microsoft.com/office/word/2015/wordml/symex" xmlns:wpg="http://schemas.microsoft.com/office/word/2010/wordprocessingGroup" xmlns:wpi="http://schemas.microsoft.com/office/word/2010/wordprocessingInk" xmlns:wne="http://schemas.microsoft.com/office/word/2006/wordml" xmlns:wps="http://schemas.microsoft.com/office/word/2010/wordprocessingShape" mc:Ignorable="w14 w15 w16se w16cid w16 w16cex w16sdtdh w16sdtfl w16du wp14">
+<w:ftr xmlns:wpc="http://schemas.microsoft.com/office/word/2010/wordprocessingCanvas" xmlns:cx="http://schemas.microsoft.com/office/drawing/2014/chartex" xmlns:cx1="http://schemas.microsoft.com/office/drawing/2015/9/8/chartex" xmlns:cx2="http://schemas.microsoft.com/office/drawing/2015/10/21/chartex" xmlns:cx3="http://schemas.microsoft.com/office/drawing/2016/5/9/chartex" xmlns:cx4="http://schemas.microsoft.com/office/drawing/2016/5/10/chartex" xmlns:cx5="http://schemas.microsoft.com/office/drawing/2016/5/11/chartex" xmlns:cx6="http://schemas.microsoft.com/office/drawing/2016/5/12/chartex" xmlns:cx7="http://schemas.microsoft.com/office/drawing/2016/5/13/chartex" xmlns:cx8="http://schemas.microsoft.com/office/drawing/2016/5/14/chartex" xmlns:mc="http://schemas.openxmlformats.org/markup-compatibility/2006" xmlns:aink="http://schemas.microsoft.com/office/drawing/2016/ink" xmlns:am3d="http://schemas.microsoft.com/office/drawing/2017/model3d" xmlns:o="urn:schemas-microsoft-com:office:office" xmlns:oel="http://schemas.microsoft.com/office/2019/extlst" xmlns:r="http://schemas.openxmlformats.org/officeDocument/2006/relationships" xmlns:m="http://schemas.openxmlformats.org/officeDocument/2006/math" xmlns:v="urn:schemas-microsoft-com:vml" xmlns:wp14="http://schemas.microsoft.com/office/word/2010/wordprocessingDrawing" xmlns:wp="http://schemas.openxmlformats.org/drawingml/2006/wordprocessingDrawing" xmlns:w10="urn:schemas-microsoft-com:office:word" xmlns:w="http://schemas.openxmlformats.org/wordprocessingml/2006/main" xmlns:w14="http://schemas.microsoft.com/office/word/2010/wordml" xmlns:w15="http://schemas.microsoft.com/office/word/2012/wordml" xmlns:w16cei="http://schemas.microsoft.com/office/word/2026/wordml/cei" xmlns:w16cex="http://schemas.microsoft.com/office/word/2018/wordml/cex" xmlns:w16cid="http://schemas.microsoft.com/office/word/2016/wordml/cid" xmlns:w16="http://schemas.microsoft.com/office/word/2018/wordml" xmlns:w16du="http://schemas.microsoft.com/office/word/2023/wordml/word16du" xmlns:w16sdtdh="http://schemas.microsoft.com/office/word/2020/wordml/sdtdatahash" xmlns:w16sdtfl="http://schemas.microsoft.com/office/word/2024/wordml/sdtformatlock" xmlns:w16se="http://schemas.microsoft.com/office/word/2015/wordml/symex" xmlns:wpg="http://schemas.microsoft.com/office/word/2010/wordprocessingGroup" xmlns:wpi="http://schemas.microsoft.com/office/word/2010/wordprocessingInk" xmlns:wne="http://schemas.microsoft.com/office/word/2006/wordml" xmlns:wps="http://schemas.microsoft.com/office/word/2010/wordprocessingShape" mc:Ignorable="w14 w15 w16se w16cid w16 w16cex w16sdtdh w16sdtfl w16du wp14">
   <w:p>
     <w:pPr>
       <w:pStyle w:val="af0"/>
@@ -66,283 +55,52 @@
 </file>
 
 <file path=word/footer2.xml><?xml version="1.0" encoding="utf-8"?>
-<w:ftr xmlns:wpc="http://schemas.microsoft.com/office/word/2010/wordprocessingCanvas" xmlns:cx="http://schemas.microsoft.com/office/drawing/2014/chartex" xmlns:cx1="http://schemas.microsoft.com/office/drawing/2015/9/8/chartex" xmlns:cx2="http://schemas.microsoft.com/office/drawing/2015/10/21/chartex" xmlns:cx3="http://schemas.microsoft.com/office/drawing/2016/5/9/chartex" xmlns:cx4="http://schemas.microsoft.com/office/drawing/2016/5/10/chartex" xmlns:cx5="http://schemas.microsoft.com/office/drawing/2016/5/11/chartex" xmlns:cx6="http://schemas.microsoft.com/office/drawing/2016/5/12/chartex" xmlns:cx7="http://schemas.microsoft.com/office/drawing/2016/5/13/chartex" xmlns:cx8="http://schemas.microsoft.com/office/drawing/2016/5/14/chartex" xmlns:mc="http://schemas.openxmlformats.org/markup-compatibility/2006" xmlns:aink="http://schemas.microsoft.com/office/drawing/2016/ink" xmlns:am3d="http://schemas.microsoft.com/office/drawing/2017/model3d" xmlns:o="urn:schemas-microsoft-com:office:office" xmlns:oel="http://schemas.microsoft.com/office/2019/extlst" xmlns:r="http://schemas.openxmlformats.org/officeDocument/2006/relationships" xmlns:m="http://schemas.openxmlformats.org/officeDocument/2006/math" xmlns:v="urn:schemas-microsoft-com:vml" xmlns:wp14="http://schemas.microsoft.com/office/word/2010/wordprocessingDrawing" xmlns:wp="http://schemas.openxmlformats.org/drawingml/2006/wordprocessingDrawing" xmlns:w10="urn:schemas-microsoft-com:office:word" xmlns:w="http://schemas.openxmlformats.org/wordprocessingml/2006/main" xmlns:w14="http://schemas.microsoft.com/office/word/2010/wordml" xmlns:w15="http://schemas.microsoft.com/office/word/2012/wordml" xmlns:w16cex="http://schemas.microsoft.com/office/word/2018/wordml/cex" xmlns:w16cid="http://schemas.microsoft.com/office/word/2016/wordml/cid" xmlns:w16="http://schemas.microsoft.com/office/word/2018/wordml" xmlns:w16du="http://schemas.microsoft.com/office/word/2023/wordml/word16du" xmlns:w16sdtdh="http://schemas.microsoft.com/office/word/2020/wordml/sdtdatahash" xmlns:w16sdtfl="http://schemas.microsoft.com/office/word/2024/wordml/sdtformatlock" xmlns:w16se="http://schemas.microsoft.com/office/word/2015/wordml/symex" xmlns:wpg="http://schemas.microsoft.com/office/word/2010/wordprocessingGroup" xmlns:wpi="http://schemas.microsoft.com/office/word/2010/wordprocessingInk" xmlns:wne="http://schemas.microsoft.com/office/word/2006/wordml" xmlns:wps="http://schemas.microsoft.com/office/word/2010/wordprocessingShape" mc:Ignorable="w14 w15 w16se w16cid w16 w16cex w16sdtdh w16sdtfl w16du wp14">
-  <w:p>
-    <w:pPr>
-      <w:pStyle w:val="af0"/>
-      <w:jc w:val="right"/>
+<w:ftr xmlns:wpc="http://schemas.microsoft.com/office/word/2010/wordprocessingCanvas" xmlns:cx="http://schemas.microsoft.com/office/drawing/2014/chartex" xmlns:cx1="http://schemas.microsoft.com/office/drawing/2015/9/8/chartex" xmlns:cx2="http://schemas.microsoft.com/office/drawing/2015/10/21/chartex" xmlns:cx3="http://schemas.microsoft.com/office/drawing/2016/5/9/chartex" xmlns:cx4="http://schemas.microsoft.com/office/drawing/2016/5/10/chartex" xmlns:cx5="http://schemas.microsoft.com/office/drawing/2016/5/11/chartex" xmlns:cx6="http://schemas.microsoft.com/office/drawing/2016/5/12/chartex" xmlns:cx7="http://schemas.microsoft.com/office/drawing/2016/5/13/chartex" xmlns:cx8="http://schemas.microsoft.com/office/drawing/2016/5/14/chartex" xmlns:mc="http://schemas.openxmlformats.org/markup-compatibility/2006" xmlns:aink="http://schemas.microsoft.com/office/drawing/2016/ink" xmlns:am3d="http://schemas.microsoft.com/office/drawing/2017/model3d" xmlns:o="urn:schemas-microsoft-com:office:office" xmlns:oel="http://schemas.microsoft.com/office/2019/extlst" xmlns:r="http://schemas.openxmlformats.org/officeDocument/2006/relationships" xmlns:m="http://schemas.openxmlformats.org/officeDocument/2006/math" xmlns:v="urn:schemas-microsoft-com:vml" xmlns:wp14="http://schemas.microsoft.com/office/word/2010/wordprocessingDrawing" xmlns:wp="http://schemas.openxmlformats.org/drawingml/2006/wordprocessingDrawing" xmlns:w10="urn:schemas-microsoft-com:office:word" xmlns:w="http://schemas.openxmlformats.org/wordprocessingml/2006/main" xmlns:w14="http://schemas.microsoft.com/office/word/2010/wordml" xmlns:w15="http://schemas.microsoft.com/office/word/2012/wordml" xmlns:w16cei="http://schemas.microsoft.com/office/word/2026/wordml/cei" xmlns:w16cex="http://schemas.microsoft.com/office/word/2018/wordml/cex" xmlns:w16cid="http://schemas.microsoft.com/office/word/2016/wordml/cid" xmlns:w16="http://schemas.microsoft.com/office/word/2018/wordml" xmlns:w16du="http://schemas.microsoft.com/office/word/2023/wordml/word16du" xmlns:w16sdtdh="http://schemas.microsoft.com/office/word/2020/wordml/sdtdatahash" xmlns:w16sdtfl="http://schemas.microsoft.com/office/word/2024/wordml/sdtformatlock" xmlns:w16se="http://schemas.microsoft.com/office/word/2015/wordml/symex" xmlns:wpg="http://schemas.microsoft.com/office/word/2010/wordprocessingGroup" xmlns:wpi="http://schemas.microsoft.com/office/word/2010/wordprocessingInk" xmlns:wne="http://schemas.microsoft.com/office/word/2006/wordml" xmlns:wps="http://schemas.microsoft.com/office/word/2010/wordprocessingShape" mc:Ignorable="w14 w15 w16se w16cid w16 w16cex w16sdtdh w16sdtfl w16du wp14">
+  <w:sdt>
+    <w:sdtPr>
+      <w:id w:val="2018809192"/>
+      <w:docPartObj>
+        <w:docPartGallery w:val="Page Numbers (Bottom of Page)"/>
+        <w:docPartUnique/>
+      </w:docPartObj>
+    </w:sdtPr>
+    <w:sdtEndPr>
       <w:rPr>
         <w:rFonts w:ascii="思源黑体" w:eastAsia="思源黑体" w:hAnsi="思源黑体"/>
-        <w:color w:val="3A3A3A" w:themeColor="background2" w:themeShade="40"/>
         <w:sz w:val="13"/>
         <w:szCs w:val="13"/>
       </w:rPr>
-    </w:pPr>
-    <w:r>
-      <w:rPr>
-        <w:rFonts w:ascii="思源黑体" w:eastAsia="思源黑体" w:hAnsi="思源黑体" w:hint="eastAsia"/>
-        <w:noProof/>
-        <w:color w:val="E8E8E8" w:themeColor="background2"/>
-        <w:sz w:val="13"/>
-        <w:szCs w:val="13"/>
-      </w:rPr>
-      <mc:AlternateContent>
-        <mc:Choice Requires="wps">
-          <w:drawing>
-            <wp:anchor distT="0" distB="0" distL="114300" distR="114300" simplePos="0" relativeHeight="251659264" behindDoc="0" locked="0" layoutInCell="1" allowOverlap="1" wp14:anchorId="0DB587CF" wp14:editId="58343CB3">
-              <wp:simplePos x="0" y="0"/>
-              <wp:positionH relativeFrom="margin">
-                <wp:align>left</wp:align>
-              </wp:positionH>
-              <wp:positionV relativeFrom="page">
-                <wp:posOffset>9766300</wp:posOffset>
-              </wp:positionV>
-              <wp:extent cx="3822700" cy="304800"/>
-              <wp:effectExtent l="0" t="0" r="0" b="0"/>
-              <wp:wrapNone/>
-              <wp:docPr id="1061770343" name="文本框 2"/>
-              <wp:cNvGraphicFramePr/>
-              <a:graphic xmlns:a="http://schemas.openxmlformats.org/drawingml/2006/main">
-                <a:graphicData uri="http://schemas.microsoft.com/office/word/2010/wordprocessingShape">
-                  <wps:wsp>
-                    <wps:cNvSpPr txBox="1"/>
-                    <wps:spPr>
-                      <a:xfrm>
-                        <a:off x="0" y="0"/>
-                        <a:ext cx="3822700" cy="304800"/>
-                      </a:xfrm>
-                      <a:prstGeom prst="rect">
-                        <a:avLst/>
-                      </a:prstGeom>
-                      <a:noFill/>
-                      <a:ln w="6350">
-                        <a:noFill/>
-                      </a:ln>
-                    </wps:spPr>
-                    <wps:txbx>
-                      <w:txbxContent>
-                        <w:p>
-                          <w:pPr>
-                            <w:jc w:val="center"/>
-                            <w:rPr>
-                              <w:rFonts w:ascii="思源黑体" w:eastAsia="思源黑体" w:hAnsi="思源黑体"/>
-                              <w:color w:val="747474" w:themeColor="background2" w:themeShade="80"/>
-                              <w:sz w:val="13"/>
-                              <w:szCs w:val="13"/>
-                            </w:rPr>
-                          </w:pPr>
-                          <w:r>
-                            <w:rPr>
-                              <w:rFonts w:ascii="思源黑体" w:eastAsia="思源黑体" w:hAnsi="思源黑体"/>
-                              <w:color w:val="747474" w:themeColor="background2" w:themeShade="80"/>
-                              <w:sz w:val="13"/>
-                              <w:szCs w:val="13"/>
-                            </w:rPr>
-                            <w:t>Prepared for client document collection</w:t>
-                          </w:r>
-                        </w:p>
-                      </w:txbxContent>
-                    </wps:txbx>
-                    <wps:bodyPr rot="0" spcFirstLastPara="0" vertOverflow="overflow" horzOverflow="overflow" vert="horz" wrap="square" lIns="91440" tIns="45720" rIns="91440" bIns="45720" numCol="1" spcCol="0" rtlCol="0" fromWordArt="0" anchor="t" anchorCtr="0" forceAA="0" compatLnSpc="1">
-                      <a:prstTxWarp prst="textNoShape">
-                        <a:avLst/>
-                      </a:prstTxWarp>
-                      <a:noAutofit/>
-                    </wps:bodyPr>
-                  </wps:wsp>
-                </a:graphicData>
-              </a:graphic>
-            </wp:anchor>
-          </w:drawing>
-        </mc:Choice>
-        <mc:Fallback xmlns:w16cei="http://schemas.microsoft.com/office/word/2026/wordml/cei">
-          <w:pict>
-            <v:shapetype w14:anchorId="0DB587CF" id="_x0000_t202" coordsize="21600,21600" o:spt="202" path="m,l,21600r21600,l21600,xe">
-              <v:stroke joinstyle="miter"/>
-              <v:path gradientshapeok="t" o:connecttype="rect"/>
-            </v:shapetype>
-            <v:shape id="文本框 2" o:spid="_x0000_s1026" type="#_x0000_t202" style="position:absolute;left:0;text-align:left;margin-left:0;margin-top:769pt;width:301pt;height:24pt;z-index:251659264;visibility:visible;mso-wrap-style:square;mso-wrap-distance-left:9pt;mso-wrap-distance-top:0;mso-wrap-distance-right:9pt;mso-wrap-distance-bottom:0;mso-position-horizontal:left;mso-position-horizontal-relative:margin;mso-position-vertical:absolute;mso-position-vertical-relative:page;v-text-anchor:top" o:gfxdata="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" filled="f" stroked="f" strokeweight=".5pt">
-              <v:textbox>
-                <w:txbxContent>
-                  <w:p>
-                    <w:pPr>
-                      <w:jc w:val="center"/>
-                      <w:rPr>
-                        <w:rFonts w:ascii="思源黑体" w:eastAsia="思源黑体" w:hAnsi="思源黑体"/>
-                        <w:color w:val="747474" w:themeColor="background2" w:themeShade="80"/>
-                        <w:sz w:val="13"/>
-                        <w:szCs w:val="13"/>
-                      </w:rPr>
-                    </w:pPr>
-                    <w:r>
-                      <w:rPr>
-                        <w:rFonts w:ascii="思源黑体" w:eastAsia="思源黑体" w:hAnsi="思源黑体"/>
-                        <w:color w:val="747474" w:themeColor="background2" w:themeShade="80"/>
-                        <w:sz w:val="13"/>
-                        <w:szCs w:val="13"/>
-                      </w:rPr>
-                      <w:t>Prepared for client document collection</w:t>
-                    </w:r>
-                  </w:p>
-                </w:txbxContent>
-              </v:textbox>
-              <w10:wrap anchorx="margin" anchory="page"/>
-            </v:shape>
-          </w:pict>
-        </mc:Fallback>
-      </mc:AlternateContent>
-    </w:r>
-    <w:r>
-      <w:rPr>
-        <w:rFonts w:ascii="思源黑体" w:eastAsia="思源黑体" w:hAnsi="思源黑体" w:hint="eastAsia"/>
-        <w:noProof/>
-        <w:color w:val="E8E8E8" w:themeColor="background2"/>
-        <w:sz w:val="13"/>
-        <w:szCs w:val="13"/>
-      </w:rPr>
-      <mc:AlternateContent>
-        <mc:Choice Requires="wps">
-          <w:drawing>
-            <wp:anchor distT="0" distB="0" distL="114300" distR="114300" simplePos="0" relativeHeight="251661312" behindDoc="0" locked="0" layoutInCell="1" allowOverlap="1" wp14:anchorId="676E1BB8" wp14:editId="7F81E5AB">
-              <wp:simplePos x="0" y="0"/>
-              <wp:positionH relativeFrom="column">
-                <wp:posOffset>3898900</wp:posOffset>
-              </wp:positionH>
-              <wp:positionV relativeFrom="page">
-                <wp:posOffset>9766300</wp:posOffset>
-              </wp:positionV>
-              <wp:extent cx="1911350" cy="304800"/>
-              <wp:effectExtent l="0" t="0" r="0" b="0"/>
-              <wp:wrapNone/>
-              <wp:docPr id="1487917982" name="文本框 2"/>
-              <wp:cNvGraphicFramePr/>
-              <a:graphic xmlns:a="http://schemas.openxmlformats.org/drawingml/2006/main">
-                <a:graphicData uri="http://schemas.microsoft.com/office/word/2010/wordprocessingShape">
-                  <wps:wsp>
-                    <wps:cNvSpPr txBox="1"/>
-                    <wps:spPr>
-                      <a:xfrm>
-                        <a:off x="0" y="0"/>
-                        <a:ext cx="1911350" cy="304800"/>
-                      </a:xfrm>
-                      <a:prstGeom prst="rect">
-                        <a:avLst/>
-                      </a:prstGeom>
-                      <a:noFill/>
-                      <a:ln w="6350">
-                        <a:noFill/>
-                      </a:ln>
-                    </wps:spPr>
-                    <wps:txbx>
-                      <w:txbxContent>
-                        <w:p>
-                          <w:pPr>
-                            <w:jc w:val="center"/>
-                            <w:rPr>
-                              <w:rFonts w:ascii="思源黑体" w:eastAsia="思源黑体" w:hAnsi="思源黑体"/>
-                              <w:color w:val="FFFFFF" w:themeColor="background1"/>
-                              <w:sz w:val="13"/>
-                              <w:szCs w:val="13"/>
-                            </w:rPr>
-                          </w:pPr>
-                          <w:r>
-                            <w:rPr>
-                              <w:rFonts w:ascii="思源黑体" w:eastAsia="思源黑体" w:hAnsi="思源黑体"/>
-                              <w:color w:val="FFFFFF" w:themeColor="background1"/>
-                              <w:sz w:val="13"/>
-                              <w:szCs w:val="13"/>
-                            </w:rPr>
-                            <w:t>482 Core Skills employer checklist</w:t>
-                          </w:r>
-                        </w:p>
-                      </w:txbxContent>
-                    </wps:txbx>
-                    <wps:bodyPr rot="0" spcFirstLastPara="0" vertOverflow="overflow" horzOverflow="overflow" vert="horz" wrap="square" lIns="91440" tIns="45720" rIns="91440" bIns="45720" numCol="1" spcCol="0" rtlCol="0" fromWordArt="0" anchor="t" anchorCtr="0" forceAA="0" compatLnSpc="1">
-                      <a:prstTxWarp prst="textNoShape">
-                        <a:avLst/>
-                      </a:prstTxWarp>
-                      <a:noAutofit/>
-                    </wps:bodyPr>
-                  </wps:wsp>
-                </a:graphicData>
-              </a:graphic>
-              <wp14:sizeRelH relativeFrom="margin">
-                <wp14:pctWidth>0</wp14:pctWidth>
-              </wp14:sizeRelH>
-            </wp:anchor>
-          </w:drawing>
-        </mc:Choice>
-        <mc:Fallback xmlns:w16cei="http://schemas.microsoft.com/office/word/2026/wordml/cei">
-          <w:pict>
-            <v:shape w14:anchorId="676E1BB8" id="_x0000_s1027" type="#_x0000_t202" style="position:absolute;left:0;text-align:left;margin-left:307pt;margin-top:769pt;width:150.5pt;height:24pt;z-index:251661312;visibility:visible;mso-wrap-style:square;mso-width-percent:0;mso-wrap-distance-left:9pt;mso-wrap-distance-top:0;mso-wrap-distance-right:9pt;mso-wrap-distance-bottom:0;mso-position-horizontal:absolute;mso-position-horizontal-relative:text;mso-position-vertical:absolute;mso-position-vertical-relative:page;mso-width-percent:0;mso-width-relative:margin;v-text-anchor:top" o:gfxdata="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" filled="f" stroked="f" strokeweight=".5pt">
-              <v:textbox>
-                <w:txbxContent>
-                  <w:p>
-                    <w:pPr>
-                      <w:jc w:val="center"/>
-                      <w:rPr>
-                        <w:rFonts w:ascii="思源黑体" w:eastAsia="思源黑体" w:hAnsi="思源黑体"/>
-                        <w:color w:val="FFFFFF" w:themeColor="background1"/>
-                        <w:sz w:val="13"/>
-                        <w:szCs w:val="13"/>
-                      </w:rPr>
-                    </w:pPr>
-                    <w:r>
-                      <w:rPr>
-                        <w:rFonts w:ascii="思源黑体" w:eastAsia="思源黑体" w:hAnsi="思源黑体"/>
-                        <w:color w:val="FFFFFF" w:themeColor="background1"/>
-                        <w:sz w:val="13"/>
-                        <w:szCs w:val="13"/>
-                      </w:rPr>
-                      <w:t>482 Core Skills employer checklist</w:t>
-                    </w:r>
-                  </w:p>
-                </w:txbxContent>
-              </v:textbox>
-              <w10:wrap anchory="page"/>
-            </v:shape>
-          </w:pict>
-        </mc:Fallback>
-      </mc:AlternateContent>
-    </w:r>
-    <w:sdt>
-      <w:sdtPr>
-        <w:id w:val="-731228416"/>
-        <w:docPartObj>
-          <w:docPartGallery w:val="Page Numbers (Bottom of Page)"/>
-          <w:docPartUnique/>
-        </w:docPartObj>
-      </w:sdtPr>
-      <w:sdtEndPr>
-        <w:rPr>
-          <w:rFonts w:ascii="思源黑体" w:eastAsia="思源黑体" w:hAnsi="思源黑体"/>
-          <w:color w:val="3A3A3A" w:themeColor="background2" w:themeShade="40"/>
-          <w:sz w:val="13"/>
-          <w:szCs w:val="13"/>
-        </w:rPr>
-      </w:sdtEndPr>
-      <w:sdtContent>
-        <w:sdt>
-          <w:sdtPr>
-            <w:id w:val="-1769616900"/>
-            <w:docPartObj>
-              <w:docPartGallery w:val="Page Numbers (Top of Page)"/>
-              <w:docPartUnique/>
-            </w:docPartObj>
-          </w:sdtPr>
-          <w:sdtEndPr>
-            <w:rPr>
-              <w:rFonts w:ascii="思源黑体" w:eastAsia="思源黑体" w:hAnsi="思源黑体"/>
-              <w:color w:val="3A3A3A" w:themeColor="background2" w:themeShade="40"/>
-              <w:sz w:val="13"/>
-              <w:szCs w:val="13"/>
-            </w:rPr>
-          </w:sdtEndPr>
-          <w:sdtContent>
+    </w:sdtEndPr>
+    <w:sdtContent>
+      <w:sdt>
+        <w:sdtPr>
+          <w:id w:val="-1769616900"/>
+          <w:docPartObj>
+            <w:docPartGallery w:val="Page Numbers (Top of Page)"/>
+            <w:docPartUnique/>
+          </w:docPartObj>
+        </w:sdtPr>
+        <w:sdtEndPr>
+          <w:rPr>
+            <w:rFonts w:ascii="思源黑体" w:eastAsia="思源黑体" w:hAnsi="思源黑体"/>
+            <w:sz w:val="13"/>
+            <w:szCs w:val="13"/>
+          </w:rPr>
+        </w:sdtEndPr>
+        <w:sdtContent>
+          <w:p>
+            <w:pPr>
+              <w:pStyle w:val="af0"/>
+              <w:jc w:val="right"/>
+              <w:rPr>
+                <w:rFonts w:ascii="思源黑体" w:eastAsia="思源黑体" w:hAnsi="思源黑体"/>
+                <w:sz w:val="13"/>
+                <w:szCs w:val="13"/>
+              </w:rPr>
+            </w:pPr>
             <w:r>
               <w:rPr>
                 <w:rFonts w:ascii="思源黑体" w:eastAsia="思源黑体" w:hAnsi="思源黑体" w:hint="eastAsia"/>
-                <w:color w:val="3A3A3A" w:themeColor="background2" w:themeShade="40"/>
                 <w:sz w:val="13"/>
                 <w:szCs w:val="13"/>
               </w:rPr>
@@ -351,9 +109,9 @@
             <w:r>
               <w:rPr>
                 <w:rFonts w:ascii="思源黑体" w:eastAsia="思源黑体" w:hAnsi="思源黑体"/>
-                <w:color w:val="3A3A3A" w:themeColor="background2" w:themeShade="40"/>
                 <w:sz w:val="13"/>
                 <w:szCs w:val="13"/>
+                <w:lang w:val="zh-CN"/>
               </w:rPr>
               <w:t xml:space="preserve"> </w:t>
             </w:r>
@@ -362,7 +120,6 @@
                 <w:rFonts w:ascii="思源黑体" w:eastAsia="思源黑体" w:hAnsi="思源黑体"/>
                 <w:b/>
                 <w:bCs/>
-                <w:color w:val="3A3A3A" w:themeColor="background2" w:themeShade="40"/>
                 <w:sz w:val="13"/>
                 <w:szCs w:val="13"/>
               </w:rPr>
@@ -373,7 +130,6 @@
                 <w:rFonts w:ascii="思源黑体" w:eastAsia="思源黑体" w:hAnsi="思源黑体"/>
                 <w:b/>
                 <w:bCs/>
-                <w:color w:val="3A3A3A" w:themeColor="background2" w:themeShade="40"/>
                 <w:sz w:val="13"/>
                 <w:szCs w:val="13"/>
               </w:rPr>
@@ -384,7 +140,6 @@
                 <w:rFonts w:ascii="思源黑体" w:eastAsia="思源黑体" w:hAnsi="思源黑体"/>
                 <w:b/>
                 <w:bCs/>
-                <w:color w:val="3A3A3A" w:themeColor="background2" w:themeShade="40"/>
                 <w:sz w:val="13"/>
                 <w:szCs w:val="13"/>
               </w:rPr>
@@ -395,9 +150,9 @@
                 <w:rFonts w:ascii="思源黑体" w:eastAsia="思源黑体" w:hAnsi="思源黑体"/>
                 <w:b/>
                 <w:bCs/>
-                <w:color w:val="3A3A3A" w:themeColor="background2" w:themeShade="40"/>
                 <w:sz w:val="13"/>
                 <w:szCs w:val="13"/>
+                <w:lang w:val="zh-CN"/>
               </w:rPr>
               <w:t>2</w:t>
             </w:r>
@@ -406,7 +161,6 @@
                 <w:rFonts w:ascii="思源黑体" w:eastAsia="思源黑体" w:hAnsi="思源黑体"/>
                 <w:b/>
                 <w:bCs/>
-                <w:color w:val="3A3A3A" w:themeColor="background2" w:themeShade="40"/>
                 <w:sz w:val="13"/>
                 <w:szCs w:val="13"/>
               </w:rPr>
@@ -415,27 +169,27 @@
             <w:r>
               <w:rPr>
                 <w:rFonts w:ascii="思源黑体" w:eastAsia="思源黑体" w:hAnsi="思源黑体"/>
-                <w:color w:val="3A3A3A" w:themeColor="background2" w:themeShade="40"/>
                 <w:sz w:val="13"/>
                 <w:szCs w:val="13"/>
+                <w:lang w:val="zh-CN"/>
               </w:rPr>
               <w:t xml:space="preserve"> /</w:t>
             </w:r>
             <w:r>
               <w:rPr>
                 <w:rFonts w:ascii="思源黑体" w:eastAsia="思源黑体" w:hAnsi="思源黑体" w:hint="eastAsia"/>
-                <w:color w:val="3A3A3A" w:themeColor="background2" w:themeShade="40"/>
                 <w:sz w:val="13"/>
                 <w:szCs w:val="13"/>
+                <w:lang w:val="zh-CN"/>
               </w:rPr>
               <w:t xml:space="preserve"> Page</w:t>
             </w:r>
             <w:r>
               <w:rPr>
                 <w:rFonts w:ascii="思源黑体" w:eastAsia="思源黑体" w:hAnsi="思源黑体"/>
-                <w:color w:val="3A3A3A" w:themeColor="background2" w:themeShade="40"/>
                 <w:sz w:val="13"/>
                 <w:szCs w:val="13"/>
+                <w:lang w:val="zh-CN"/>
               </w:rPr>
               <w:t xml:space="preserve"> </w:t>
             </w:r>
@@ -444,7 +198,6 @@
                 <w:rFonts w:ascii="思源黑体" w:eastAsia="思源黑体" w:hAnsi="思源黑体"/>
                 <w:b/>
                 <w:bCs/>
-                <w:color w:val="3A3A3A" w:themeColor="background2" w:themeShade="40"/>
                 <w:sz w:val="13"/>
                 <w:szCs w:val="13"/>
               </w:rPr>
@@ -455,7 +208,6 @@
                 <w:rFonts w:ascii="思源黑体" w:eastAsia="思源黑体" w:hAnsi="思源黑体"/>
                 <w:b/>
                 <w:bCs/>
-                <w:color w:val="3A3A3A" w:themeColor="background2" w:themeShade="40"/>
                 <w:sz w:val="13"/>
                 <w:szCs w:val="13"/>
               </w:rPr>
@@ -466,7 +218,6 @@
                 <w:rFonts w:ascii="思源黑体" w:eastAsia="思源黑体" w:hAnsi="思源黑体"/>
                 <w:b/>
                 <w:bCs/>
-                <w:color w:val="3A3A3A" w:themeColor="background2" w:themeShade="40"/>
                 <w:sz w:val="13"/>
                 <w:szCs w:val="13"/>
               </w:rPr>
@@ -477,9 +228,9 @@
                 <w:rFonts w:ascii="思源黑体" w:eastAsia="思源黑体" w:hAnsi="思源黑体"/>
                 <w:b/>
                 <w:bCs/>
-                <w:color w:val="3A3A3A" w:themeColor="background2" w:themeShade="40"/>
                 <w:sz w:val="13"/>
                 <w:szCs w:val="13"/>
+                <w:lang w:val="zh-CN"/>
               </w:rPr>
               <w:t>2</w:t>
             </w:r>
@@ -488,34 +239,26 @@
                 <w:rFonts w:ascii="思源黑体" w:eastAsia="思源黑体" w:hAnsi="思源黑体"/>
                 <w:b/>
                 <w:bCs/>
-                <w:color w:val="3A3A3A" w:themeColor="background2" w:themeShade="40"/>
                 <w:sz w:val="13"/>
                 <w:szCs w:val="13"/>
               </w:rPr>
               <w:fldChar w:fldCharType="end"/>
             </w:r>
-          </w:sdtContent>
-        </w:sdt>
-      </w:sdtContent>
-    </w:sdt>
-  </w:p>
+          </w:p>
+        </w:sdtContent>
+      </w:sdt>
+    </w:sdtContent>
+  </w:sdt>
   <w:p>
     <w:pPr>
       <w:pStyle w:val="af0"/>
-      <w:jc w:val="right"/>
-      <w:rPr>
-        <w:rFonts w:ascii="思源黑体" w:eastAsia="思源黑体" w:hAnsi="思源黑体"/>
-        <w:color w:val="3A3A3A" w:themeColor="background2" w:themeShade="40"/>
-        <w:sz w:val="13"/>
-        <w:szCs w:val="13"/>
-      </w:rPr>
     </w:pPr>
   </w:p>
 </w:ftr>
 </file>
 
 <file path=word/footer3.xml><?xml version="1.0" encoding="utf-8"?>
-<w:ftr xmlns:wpc="http://schemas.microsoft.com/office/word/2010/wordprocessingCanvas" xmlns:cx="http://schemas.microsoft.com/office/drawing/2014/chartex" xmlns:cx1="http://schemas.microsoft.com/office/drawing/2015/9/8/chartex" xmlns:cx2="http://schemas.microsoft.com/office/drawing/2015/10/21/chartex" xmlns:cx3="http://schemas.microsoft.com/office/drawing/2016/5/9/chartex" xmlns:cx4="http://schemas.microsoft.com/office/drawing/2016/5/10/chartex" xmlns:cx5="http://schemas.microsoft.com/office/drawing/2016/5/11/chartex" xmlns:cx6="http://schemas.microsoft.com/office/drawing/2016/5/12/chartex" xmlns:cx7="http://schemas.microsoft.com/office/drawing/2016/5/13/chartex" xmlns:cx8="http://schemas.microsoft.com/office/drawing/2016/5/14/chartex" xmlns:mc="http://schemas.openxmlformats.org/markup-compatibility/2006" xmlns:aink="http://schemas.microsoft.com/office/drawing/2016/ink" xmlns:am3d="http://schemas.microsoft.com/office/drawing/2017/model3d" xmlns:o="urn:schemas-microsoft-com:office:office" xmlns:oel="http://schemas.microsoft.com/office/2019/extlst" xmlns:r="http://schemas.openxmlformats.org/officeDocument/2006/relationships" xmlns:m="http://schemas.openxmlformats.org/officeDocument/2006/math" xmlns:v="urn:schemas-microsoft-com:vml" xmlns:wp14="http://schemas.microsoft.com/office/word/2010/wordprocessingDrawing" xmlns:wp="http://schemas.openxmlformats.org/drawingml/2006/wordprocessingDrawing" xmlns:w10="urn:schemas-microsoft-com:office:word" xmlns:w="http://schemas.openxmlformats.org/wordprocessingml/2006/main" xmlns:w14="http://schemas.microsoft.com/office/word/2010/wordml" xmlns:w15="http://schemas.microsoft.com/office/word/2012/wordml" xmlns:w16cex="http://schemas.microsoft.com/office/word/2018/wordml/cex" xmlns:w16cid="http://schemas.microsoft.com/office/word/2016/wordml/cid" xmlns:w16="http://schemas.microsoft.com/office/word/2018/wordml" xmlns:w16du="http://schemas.microsoft.com/office/word/2023/wordml/word16du" xmlns:w16sdtdh="http://schemas.microsoft.com/office/word/2020/wordml/sdtdatahash" xmlns:w16sdtfl="http://schemas.microsoft.com/office/word/2024/wordml/sdtformatlock" xmlns:w16se="http://schemas.microsoft.com/office/word/2015/wordml/symex" xmlns:wpg="http://schemas.microsoft.com/office/word/2010/wordprocessingGroup" xmlns:wpi="http://schemas.microsoft.com/office/word/2010/wordprocessingInk" xmlns:wne="http://schemas.microsoft.com/office/word/2006/wordml" xmlns:wps="http://schemas.microsoft.com/office/word/2010/wordprocessingShape" mc:Ignorable="w14 w15 w16se w16cid w16 w16cex w16sdtdh w16sdtfl w16du wp14">
+<w:ftr xmlns:wpc="http://schemas.microsoft.com/office/word/2010/wordprocessingCanvas" xmlns:cx="http://schemas.microsoft.com/office/drawing/2014/chartex" xmlns:cx1="http://schemas.microsoft.com/office/drawing/2015/9/8/chartex" xmlns:cx2="http://schemas.microsoft.com/office/drawing/2015/10/21/chartex" xmlns:cx3="http://schemas.microsoft.com/office/drawing/2016/5/9/chartex" xmlns:cx4="http://schemas.microsoft.com/office/drawing/2016/5/10/chartex" xmlns:cx5="http://schemas.microsoft.com/office/drawing/2016/5/11/chartex" xmlns:cx6="http://schemas.microsoft.com/office/drawing/2016/5/12/chartex" xmlns:cx7="http://schemas.microsoft.com/office/drawing/2016/5/13/chartex" xmlns:cx8="http://schemas.microsoft.com/office/drawing/2016/5/14/chartex" xmlns:mc="http://schemas.openxmlformats.org/markup-compatibility/2006" xmlns:aink="http://schemas.microsoft.com/office/drawing/2016/ink" xmlns:am3d="http://schemas.microsoft.com/office/drawing/2017/model3d" xmlns:o="urn:schemas-microsoft-com:office:office" xmlns:oel="http://schemas.microsoft.com/office/2019/extlst" xmlns:r="http://schemas.openxmlformats.org/officeDocument/2006/relationships" xmlns:m="http://schemas.openxmlformats.org/officeDocument/2006/math" xmlns:v="urn:schemas-microsoft-com:vml" xmlns:wp14="http://schemas.microsoft.com/office/word/2010/wordprocessingDrawing" xmlns:wp="http://schemas.openxmlformats.org/drawingml/2006/wordprocessingDrawing" xmlns:w10="urn:schemas-microsoft-com:office:word" xmlns:w="http://schemas.openxmlformats.org/wordprocessingml/2006/main" xmlns:w14="http://schemas.microsoft.com/office/word/2010/wordml" xmlns:w15="http://schemas.microsoft.com/office/word/2012/wordml" xmlns:w16cei="http://schemas.microsoft.com/office/word/2026/wordml/cei" xmlns:w16cex="http://schemas.microsoft.com/office/word/2018/wordml/cex" xmlns:w16cid="http://schemas.microsoft.com/office/word/2016/wordml/cid" xmlns:w16="http://schemas.microsoft.com/office/word/2018/wordml" xmlns:w16du="http://schemas.microsoft.com/office/word/2023/wordml/word16du" xmlns:w16sdtdh="http://schemas.microsoft.com/office/word/2020/wordml/sdtdatahash" xmlns:w16sdtfl="http://schemas.microsoft.com/office/word/2024/wordml/sdtformatlock" xmlns:w16se="http://schemas.microsoft.com/office/word/2015/wordml/symex" xmlns:wpg="http://schemas.microsoft.com/office/word/2010/wordprocessingGroup" xmlns:wpi="http://schemas.microsoft.com/office/word/2010/wordprocessingInk" xmlns:wne="http://schemas.microsoft.com/office/word/2006/wordml" xmlns:wps="http://schemas.microsoft.com/office/word/2010/wordprocessingShape" mc:Ignorable="w14 w15 w16se w16cid w16 w16cex w16sdtdh w16sdtfl w16du wp14">
   <w:p>
     <w:pPr>
       <w:pStyle w:val="af0"/>
@@ -525,7 +268,7 @@
 </file>
 
 <file path=word/footnotes.xml><?xml version="1.0" encoding="utf-8"?>
-<w:footnotes xmlns:wpc="http://schemas.microsoft.com/office/word/2010/wordprocessingCanvas" xmlns:cx="http://schemas.microsoft.com/office/drawing/2014/chartex" xmlns:cx1="http://schemas.microsoft.com/office/drawing/2015/9/8/chartex" xmlns:cx2="http://schemas.microsoft.com/office/drawing/2015/10/21/chartex" xmlns:cx3="http://schemas.microsoft.com/office/drawing/2016/5/9/chartex" xmlns:cx4="http://schemas.microsoft.com/office/drawing/2016/5/10/chartex" xmlns:cx5="http://schemas.microsoft.com/office/drawing/2016/5/11/chartex" xmlns:cx6="http://schemas.microsoft.com/office/drawing/2016/5/12/chartex" xmlns:cx7="http://schemas.microsoft.com/office/drawing/2016/5/13/chartex" xmlns:cx8="http://schemas.microsoft.com/office/drawing/2016/5/14/chartex" xmlns:mc="http://schemas.openxmlformats.org/markup-compatibility/2006" xmlns:aink="http://schemas.microsoft.com/office/drawing/2016/ink" xmlns:am3d="http://schemas.microsoft.com/office/drawing/2017/model3d" xmlns:o="urn:schemas-microsoft-com:office:office" xmlns:oel="http://schemas.microsoft.com/office/2019/extlst" xmlns:r="http://schemas.openxmlformats.org/officeDocument/2006/relationships" xmlns:m="http://schemas.openxmlformats.org/officeDocument/2006/math" xmlns:v="urn:schemas-microsoft-com:vml" xmlns:wp14="http://schemas.microsoft.com/office/word/2010/wordprocessingDrawing" xmlns:wp="http://schemas.openxmlformats.org/drawingml/2006/wordprocessingDrawing" xmlns:w10="urn:schemas-microsoft-com:office:word" xmlns:w="http://schemas.openxmlformats.org/wordprocessingml/2006/main" xmlns:w14="http://schemas.microsoft.com/office/word/2010/wordml" xmlns:w15="http://schemas.microsoft.com/office/word/2012/wordml" xmlns:w16cex="http://schemas.microsoft.com/office/word/2018/wordml/cex" xmlns:w16cid="http://schemas.microsoft.com/office/word/2016/wordml/cid" xmlns:w16="http://schemas.microsoft.com/office/word/2018/wordml" xmlns:w16du="http://schemas.microsoft.com/office/word/2023/wordml/word16du" xmlns:w16sdtdh="http://schemas.microsoft.com/office/word/2020/wordml/sdtdatahash" xmlns:w16sdtfl="http://schemas.microsoft.com/office/word/2024/wordml/sdtformatlock" xmlns:w16se="http://schemas.microsoft.com/office/word/2015/wordml/symex" xmlns:wpg="http://schemas.microsoft.com/office/word/2010/wordprocessingGroup" xmlns:wpi="http://schemas.microsoft.com/office/word/2010/wordprocessingInk" xmlns:wne="http://schemas.microsoft.com/office/word/2006/wordml" xmlns:wps="http://schemas.microsoft.com/office/word/2010/wordprocessingShape" mc:Ignorable="w14 w15 w16se w16cid w16 w16cex w16sdtdh w16sdtfl w16du wp14">
+<w:footnotes xmlns:wpc="http://schemas.microsoft.com/office/word/2010/wordprocessingCanvas" xmlns:cx="http://schemas.microsoft.com/office/drawing/2014/chartex" xmlns:cx1="http://schemas.microsoft.com/office/drawing/2015/9/8/chartex" xmlns:cx2="http://schemas.microsoft.com/office/drawing/2015/10/21/chartex" xmlns:cx3="http://schemas.microsoft.com/office/drawing/2016/5/9/chartex" xmlns:cx4="http://schemas.microsoft.com/office/drawing/2016/5/10/chartex" xmlns:cx5="http://schemas.microsoft.com/office/drawing/2016/5/11/chartex" xmlns:cx6="http://schemas.microsoft.com/office/drawing/2016/5/12/chartex" xmlns:cx7="http://schemas.microsoft.com/office/drawing/2016/5/13/chartex" xmlns:cx8="http://schemas.microsoft.com/office/drawing/2016/5/14/chartex" xmlns:mc="http://schemas.openxmlformats.org/markup-compatibility/2006" xmlns:aink="http://schemas.microsoft.com/office/drawing/2016/ink" xmlns:am3d="http://schemas.microsoft.com/office/drawing/2017/model3d" xmlns:o="urn:schemas-microsoft-com:office:office" xmlns:oel="http://schemas.microsoft.com/office/2019/extlst" xmlns:r="http://schemas.openxmlformats.org/officeDocument/2006/relationships" xmlns:m="http://schemas.openxmlformats.org/officeDocument/2006/math" xmlns:v="urn:schemas-microsoft-com:vml" xmlns:wp14="http://schemas.microsoft.com/office/word/2010/wordprocessingDrawing" xmlns:wp="http://schemas.openxmlformats.org/drawingml/2006/wordprocessingDrawing" xmlns:w10="urn:schemas-microsoft-com:office:word" xmlns:w="http://schemas.openxmlformats.org/wordprocessingml/2006/main" xmlns:w14="http://schemas.microsoft.com/office/word/2010/wordml" xmlns:w15="http://schemas.microsoft.com/office/word/2012/wordml" xmlns:w16cei="http://schemas.microsoft.com/office/word/2026/wordml/cei" xmlns:w16cex="http://schemas.microsoft.com/office/word/2018/wordml/cex" xmlns:w16cid="http://schemas.microsoft.com/office/word/2016/wordml/cid" xmlns:w16="http://schemas.microsoft.com/office/word/2018/wordml" xmlns:w16du="http://schemas.microsoft.com/office/word/2023/wordml/word16du" xmlns:w16sdtdh="http://schemas.microsoft.com/office/word/2020/wordml/sdtdatahash" xmlns:w16sdtfl="http://schemas.microsoft.com/office/word/2024/wordml/sdtformatlock" xmlns:w16se="http://schemas.microsoft.com/office/word/2015/wordml/symex" xmlns:wpg="http://schemas.microsoft.com/office/word/2010/wordprocessingGroup" xmlns:wpi="http://schemas.microsoft.com/office/word/2010/wordprocessingInk" xmlns:wne="http://schemas.microsoft.com/office/word/2006/wordml" xmlns:wps="http://schemas.microsoft.com/office/word/2010/wordprocessingShape" mc:Ignorable="w14 w15 w16se w16cid w16 w16cex w16sdtdh w16sdtfl w16du wp14">
   <w:footnote w:type="separator" w:id="-1">
     <w:p>
       <w:pPr>
@@ -550,7 +293,7 @@
 </file>
 
 <file path=word/header1.xml><?xml version="1.0" encoding="utf-8"?>
-<w:hdr xmlns:wpc="http://schemas.microsoft.com/office/word/2010/wordprocessingCanvas" xmlns:cx="http://schemas.microsoft.com/office/drawing/2014/chartex" xmlns:cx1="http://schemas.microsoft.com/office/drawing/2015/9/8/chartex" xmlns:cx2="http://schemas.microsoft.com/office/drawing/2015/10/21/chartex" xmlns:cx3="http://schemas.microsoft.com/office/drawing/2016/5/9/chartex" xmlns:cx4="http://schemas.microsoft.com/office/drawing/2016/5/10/chartex" xmlns:cx5="http://schemas.microsoft.com/office/drawing/2016/5/11/chartex" xmlns:cx6="http://schemas.microsoft.com/office/drawing/2016/5/12/chartex" xmlns:cx7="http://schemas.microsoft.com/office/drawing/2016/5/13/chartex" xmlns:cx8="http://schemas.microsoft.com/office/drawing/2016/5/14/chartex" xmlns:mc="http://schemas.openxmlformats.org/markup-compatibility/2006" xmlns:aink="http://schemas.microsoft.com/office/drawing/2016/ink" xmlns:am3d="http://schemas.microsoft.com/office/drawing/2017/model3d" xmlns:o="urn:schemas-microsoft-com:office:office" xmlns:oel="http://schemas.microsoft.com/office/2019/extlst" xmlns:r="http://schemas.openxmlformats.org/officeDocument/2006/relationships" xmlns:m="http://schemas.openxmlformats.org/officeDocument/2006/math" xmlns:v="urn:schemas-microsoft-com:vml" xmlns:wp14="http://schemas.microsoft.com/office/word/2010/wordprocessingDrawing" xmlns:wp="http://schemas.openxmlformats.org/drawingml/2006/wordprocessingDrawing" xmlns:w10="urn:schemas-microsoft-com:office:word" xmlns:w="http://schemas.openxmlformats.org/wordprocessingml/2006/main" xmlns:w14="http://schemas.microsoft.com/office/word/2010/wordml" xmlns:w15="http://schemas.microsoft.com/office/word/2012/wordml" xmlns:w16cex="http://schemas.microsoft.com/office/word/2018/wordml/cex" xmlns:w16cid="http://schemas.microsoft.com/office/word/2016/wordml/cid" xmlns:w16="http://schemas.microsoft.com/office/word/2018/wordml" xmlns:w16du="http://schemas.microsoft.com/office/word/2023/wordml/word16du" xmlns:w16sdtdh="http://schemas.microsoft.com/office/word/2020/wordml/sdtdatahash" xmlns:w16sdtfl="http://schemas.microsoft.com/office/word/2024/wordml/sdtformatlock" xmlns:w16se="http://schemas.microsoft.com/office/word/2015/wordml/symex" xmlns:wpg="http://schemas.microsoft.com/office/word/2010/wordprocessingGroup" xmlns:wpi="http://schemas.microsoft.com/office/word/2010/wordprocessingInk" xmlns:wne="http://schemas.microsoft.com/office/word/2006/wordml" xmlns:wps="http://schemas.microsoft.com/office/word/2010/wordprocessingShape" mc:Ignorable="w14 w15 w16se w16cid w16 w16cex w16sdtdh w16sdtfl w16du wp14">
+<w:hdr xmlns:wpc="http://schemas.microsoft.com/office/word/2010/wordprocessingCanvas" xmlns:cx="http://schemas.microsoft.com/office/drawing/2014/chartex" xmlns:cx1="http://schemas.microsoft.com/office/drawing/2015/9/8/chartex" xmlns:cx2="http://schemas.microsoft.com/office/drawing/2015/10/21/chartex" xmlns:cx3="http://schemas.microsoft.com/office/drawing/2016/5/9/chartex" xmlns:cx4="http://schemas.microsoft.com/office/drawing/2016/5/10/chartex" xmlns:cx5="http://schemas.microsoft.com/office/drawing/2016/5/11/chartex" xmlns:cx6="http://schemas.microsoft.com/office/drawing/2016/5/12/chartex" xmlns:cx7="http://schemas.microsoft.com/office/drawing/2016/5/13/chartex" xmlns:cx8="http://schemas.microsoft.com/office/drawing/2016/5/14/chartex" xmlns:mc="http://schemas.openxmlformats.org/markup-compatibility/2006" xmlns:aink="http://schemas.microsoft.com/office/drawing/2016/ink" xmlns:am3d="http://schemas.microsoft.com/office/drawing/2017/model3d" xmlns:o="urn:schemas-microsoft-com:office:office" xmlns:oel="http://schemas.microsoft.com/office/2019/extlst" xmlns:r="http://schemas.openxmlformats.org/officeDocument/2006/relationships" xmlns:m="http://schemas.openxmlformats.org/officeDocument/2006/math" xmlns:v="urn:schemas-microsoft-com:vml" xmlns:wp14="http://schemas.microsoft.com/office/word/2010/wordprocessingDrawing" xmlns:wp="http://schemas.openxmlformats.org/drawingml/2006/wordprocessingDrawing" xmlns:w10="urn:schemas-microsoft-com:office:word" xmlns:w="http://schemas.openxmlformats.org/wordprocessingml/2006/main" xmlns:w14="http://schemas.microsoft.com/office/word/2010/wordml" xmlns:w15="http://schemas.microsoft.com/office/word/2012/wordml" xmlns:w16cei="http://schemas.microsoft.com/office/word/2026/wordml/cei" xmlns:w16cex="http://schemas.microsoft.com/office/word/2018/wordml/cex" xmlns:w16cid="http://schemas.microsoft.com/office/word/2016/wordml/cid" xmlns:w16="http://schemas.microsoft.com/office/word/2018/wordml" xmlns:w16du="http://schemas.microsoft.com/office/word/2023/wordml/word16du" xmlns:w16sdtdh="http://schemas.microsoft.com/office/word/2020/wordml/sdtdatahash" xmlns:w16sdtfl="http://schemas.microsoft.com/office/word/2024/wordml/sdtformatlock" xmlns:w16se="http://schemas.microsoft.com/office/word/2015/wordml/symex" xmlns:wpg="http://schemas.microsoft.com/office/word/2010/wordprocessingGroup" xmlns:wpi="http://schemas.microsoft.com/office/word/2010/wordprocessingInk" xmlns:wne="http://schemas.microsoft.com/office/word/2006/wordml" xmlns:wps="http://schemas.microsoft.com/office/word/2010/wordprocessingShape" mc:Ignorable="w14 w15 w16se w16cid w16 w16cex w16sdtdh w16sdtfl w16du wp14">
   <w:p>
     <w:pPr>
       <w:pStyle w:val="ae"/>
@@ -560,28 +303,32 @@
 </file>
 
 <file path=word/header2.xml><?xml version="1.0" encoding="utf-8"?>
-<w:hdr xmlns:wpc="http://schemas.microsoft.com/office/word/2010/wordprocessingCanvas" xmlns:cx="http://schemas.microsoft.com/office/drawing/2014/chartex" xmlns:cx1="http://schemas.microsoft.com/office/drawing/2015/9/8/chartex" xmlns:cx2="http://schemas.microsoft.com/office/drawing/2015/10/21/chartex" xmlns:cx3="http://schemas.microsoft.com/office/drawing/2016/5/9/chartex" xmlns:cx4="http://schemas.microsoft.com/office/drawing/2016/5/10/chartex" xmlns:cx5="http://schemas.microsoft.com/office/drawing/2016/5/11/chartex" xmlns:cx6="http://schemas.microsoft.com/office/drawing/2016/5/12/chartex" xmlns:cx7="http://schemas.microsoft.com/office/drawing/2016/5/13/chartex" xmlns:cx8="http://schemas.microsoft.com/office/drawing/2016/5/14/chartex" xmlns:mc="http://schemas.openxmlformats.org/markup-compatibility/2006" xmlns:aink="http://schemas.microsoft.com/office/drawing/2016/ink" xmlns:am3d="http://schemas.microsoft.com/office/drawing/2017/model3d" xmlns:o="urn:schemas-microsoft-com:office:office" xmlns:oel="http://schemas.microsoft.com/office/2019/extlst" xmlns:r="http://schemas.openxmlformats.org/officeDocument/2006/relationships" xmlns:m="http://schemas.openxmlformats.org/officeDocument/2006/math" xmlns:v="urn:schemas-microsoft-com:vml" xmlns:wp14="http://schemas.microsoft.com/office/word/2010/wordprocessingDrawing" xmlns:wp="http://schemas.openxmlformats.org/drawingml/2006/wordprocessingDrawing" xmlns:w10="urn:schemas-microsoft-com:office:word" xmlns:w="http://schemas.openxmlformats.org/wordprocessingml/2006/main" xmlns:w14="http://schemas.microsoft.com/office/word/2010/wordml" xmlns:w15="http://schemas.microsoft.com/office/word/2012/wordml" xmlns:w16cex="http://schemas.microsoft.com/office/word/2018/wordml/cex" xmlns:w16cid="http://schemas.microsoft.com/office/word/2016/wordml/cid" xmlns:w16="http://schemas.microsoft.com/office/word/2018/wordml" xmlns:w16du="http://schemas.microsoft.com/office/word/2023/wordml/word16du" xmlns:w16sdtdh="http://schemas.microsoft.com/office/word/2020/wordml/sdtdatahash" xmlns:w16sdtfl="http://schemas.microsoft.com/office/word/2024/wordml/sdtformatlock" xmlns:w16se="http://schemas.microsoft.com/office/word/2015/wordml/symex" xmlns:wpg="http://schemas.microsoft.com/office/word/2010/wordprocessingGroup" xmlns:wpi="http://schemas.microsoft.com/office/word/2010/wordprocessingInk" xmlns:wne="http://schemas.microsoft.com/office/word/2006/wordml" xmlns:wps="http://schemas.microsoft.com/office/word/2010/wordprocessingShape" mc:Ignorable="w14 w15 w16se w16cid w16 w16cex w16sdtdh w16sdtfl w16du wp14">
+<w:hdr xmlns:wpc="http://schemas.microsoft.com/office/word/2010/wordprocessingCanvas" xmlns:cx="http://schemas.microsoft.com/office/drawing/2014/chartex" xmlns:cx1="http://schemas.microsoft.com/office/drawing/2015/9/8/chartex" xmlns:cx2="http://schemas.microsoft.com/office/drawing/2015/10/21/chartex" xmlns:cx3="http://schemas.microsoft.com/office/drawing/2016/5/9/chartex" xmlns:cx4="http://schemas.microsoft.com/office/drawing/2016/5/10/chartex" xmlns:cx5="http://schemas.microsoft.com/office/drawing/2016/5/11/chartex" xmlns:cx6="http://schemas.microsoft.com/office/drawing/2016/5/12/chartex" xmlns:cx7="http://schemas.microsoft.com/office/drawing/2016/5/13/chartex" xmlns:cx8="http://schemas.microsoft.com/office/drawing/2016/5/14/chartex" xmlns:mc="http://schemas.openxmlformats.org/markup-compatibility/2006" xmlns:aink="http://schemas.microsoft.com/office/drawing/2016/ink" xmlns:am3d="http://schemas.microsoft.com/office/drawing/2017/model3d" xmlns:o="urn:schemas-microsoft-com:office:office" xmlns:oel="http://schemas.microsoft.com/office/2019/extlst" xmlns:r="http://schemas.openxmlformats.org/officeDocument/2006/relationships" xmlns:m="http://schemas.openxmlformats.org/officeDocument/2006/math" xmlns:v="urn:schemas-microsoft-com:vml" xmlns:wp14="http://schemas.microsoft.com/office/word/2010/wordprocessingDrawing" xmlns:wp="http://schemas.openxmlformats.org/drawingml/2006/wordprocessingDrawing" xmlns:w10="urn:schemas-microsoft-com:office:word" xmlns:w="http://schemas.openxmlformats.org/wordprocessingml/2006/main" xmlns:w14="http://schemas.microsoft.com/office/word/2010/wordml" xmlns:w15="http://schemas.microsoft.com/office/word/2012/wordml" xmlns:w16cei="http://schemas.microsoft.com/office/word/2026/wordml/cei" xmlns:w16cex="http://schemas.microsoft.com/office/word/2018/wordml/cex" xmlns:w16cid="http://schemas.microsoft.com/office/word/2016/wordml/cid" xmlns:w16="http://schemas.microsoft.com/office/word/2018/wordml" xmlns:w16du="http://schemas.microsoft.com/office/word/2023/wordml/word16du" xmlns:w16sdtdh="http://schemas.microsoft.com/office/word/2020/wordml/sdtdatahash" xmlns:w16sdtfl="http://schemas.microsoft.com/office/word/2024/wordml/sdtformatlock" xmlns:w16se="http://schemas.microsoft.com/office/word/2015/wordml/symex" xmlns:wpg="http://schemas.microsoft.com/office/word/2010/wordprocessingGroup" xmlns:wpi="http://schemas.microsoft.com/office/word/2010/wordprocessingInk" xmlns:wne="http://schemas.microsoft.com/office/word/2006/wordml" xmlns:wps="http://schemas.microsoft.com/office/word/2010/wordprocessingShape" mc:Ignorable="w14 w15 w16se w16cid w16 w16cex w16sdtdh w16sdtfl w16du wp14">
   <w:p>
     <w:pPr>
       <w:pStyle w:val="ae"/>
+      <w:jc w:val="left"/>
+      <w:rPr>
+        <w:rFonts w:hint="eastAsia"/>
+      </w:rPr>
     </w:pPr>
     <w:r>
       <w:rPr>
         <w:noProof/>
       </w:rPr>
       <w:drawing>
-        <wp:anchor distT="0" distB="0" distL="114300" distR="114300" simplePos="0" relativeHeight="251662336" behindDoc="1" locked="0" layoutInCell="1" allowOverlap="1" wp14:anchorId="07A16961" wp14:editId="139EF187">
+        <wp:anchor distT="0" distB="0" distL="114300" distR="114300" simplePos="0" relativeHeight="251658240" behindDoc="1" locked="0" layoutInCell="1" allowOverlap="1" wp14:anchorId="6E09530C" wp14:editId="64F48901">
           <wp:simplePos x="0" y="0"/>
           <wp:positionH relativeFrom="page">
             <wp:align>left</wp:align>
           </wp:positionH>
-          <wp:positionV relativeFrom="paragraph">
-            <wp:posOffset>-540931</wp:posOffset>
+          <wp:positionV relativeFrom="page">
+            <wp:align>top</wp:align>
           </wp:positionV>
-          <wp:extent cx="7539920" cy="10670519"/>
-          <wp:effectExtent l="0" t="0" r="4445" b="0"/>
+          <wp:extent cx="7563600" cy="10692000"/>
+          <wp:effectExtent l="0" t="0" r="0" b="0"/>
           <wp:wrapNone/>
-          <wp:docPr id="1799437110" name="图片 3"/>
+          <wp:docPr id="1666608777" name="图片 1"/>
           <wp:cNvGraphicFramePr>
             <a:graphicFrameLocks xmlns:a="http://schemas.openxmlformats.org/drawingml/2006/main" noChangeAspect="1"/>
           </wp:cNvGraphicFramePr>
@@ -610,7 +357,7 @@
                 <pic:spPr bwMode="auto">
                   <a:xfrm>
                     <a:off x="0" y="0"/>
-                    <a:ext cx="7550128" cy="10684965"/>
+                    <a:ext cx="7563600" cy="10692000"/>
                   </a:xfrm>
                   <a:prstGeom prst="rect">
                     <a:avLst/>
@@ -637,574 +384,13 @@
 </file>
 
 <file path=word/header3.xml><?xml version="1.0" encoding="utf-8"?>
-<w:hdr xmlns:wpc="http://schemas.microsoft.com/office/word/2010/wordprocessingCanvas" xmlns:cx="http://schemas.microsoft.com/office/drawing/2014/chartex" xmlns:cx1="http://schemas.microsoft.com/office/drawing/2015/9/8/chartex" xmlns:cx2="http://schemas.microsoft.com/office/drawing/2015/10/21/chartex" xmlns:cx3="http://schemas.microsoft.com/office/drawing/2016/5/9/chartex" xmlns:cx4="http://schemas.microsoft.com/office/drawing/2016/5/10/chartex" xmlns:cx5="http://schemas.microsoft.com/office/drawing/2016/5/11/chartex" xmlns:cx6="http://schemas.microsoft.com/office/drawing/2016/5/12/chartex" xmlns:cx7="http://schemas.microsoft.com/office/drawing/2016/5/13/chartex" xmlns:cx8="http://schemas.microsoft.com/office/drawing/2016/5/14/chartex" xmlns:mc="http://schemas.openxmlformats.org/markup-compatibility/2006" xmlns:aink="http://schemas.microsoft.com/office/drawing/2016/ink" xmlns:am3d="http://schemas.microsoft.com/office/drawing/2017/model3d" xmlns:o="urn:schemas-microsoft-com:office:office" xmlns:oel="http://schemas.microsoft.com/office/2019/extlst" xmlns:r="http://schemas.openxmlformats.org/officeDocument/2006/relationships" xmlns:m="http://schemas.openxmlformats.org/officeDocument/2006/math" xmlns:v="urn:schemas-microsoft-com:vml" xmlns:wp14="http://schemas.microsoft.com/office/word/2010/wordprocessingDrawing" xmlns:wp="http://schemas.openxmlformats.org/drawingml/2006/wordprocessingDrawing" xmlns:w10="urn:schemas-microsoft-com:office:word" xmlns:w="http://schemas.openxmlformats.org/wordprocessingml/2006/main" xmlns:w14="http://schemas.microsoft.com/office/word/2010/wordml" xmlns:w15="http://schemas.microsoft.com/office/word/2012/wordml" xmlns:w16cex="http://schemas.microsoft.com/office/word/2018/wordml/cex" xmlns:w16cid="http://schemas.microsoft.com/office/word/2016/wordml/cid" xmlns:w16="http://schemas.microsoft.com/office/word/2018/wordml" xmlns:w16du="http://schemas.microsoft.com/office/word/2023/wordml/word16du" xmlns:w16sdtdh="http://schemas.microsoft.com/office/word/2020/wordml/sdtdatahash" xmlns:w16sdtfl="http://schemas.microsoft.com/office/word/2024/wordml/sdtformatlock" xmlns:w16se="http://schemas.microsoft.com/office/word/2015/wordml/symex" xmlns:wpg="http://schemas.microsoft.com/office/word/2010/wordprocessingGroup" xmlns:wpi="http://schemas.microsoft.com/office/word/2010/wordprocessingInk" xmlns:wne="http://schemas.microsoft.com/office/word/2006/wordml" xmlns:wps="http://schemas.microsoft.com/office/word/2010/wordprocessingShape" mc:Ignorable="w14 w15 w16se w16cid w16 w16cex w16sdtdh w16sdtfl w16du wp14">
+<w:hdr xmlns:wpc="http://schemas.microsoft.com/office/word/2010/wordprocessingCanvas" xmlns:cx="http://schemas.microsoft.com/office/drawing/2014/chartex" xmlns:cx1="http://schemas.microsoft.com/office/drawing/2015/9/8/chartex" xmlns:cx2="http://schemas.microsoft.com/office/drawing/2015/10/21/chartex" xmlns:cx3="http://schemas.microsoft.com/office/drawing/2016/5/9/chartex" xmlns:cx4="http://schemas.microsoft.com/office/drawing/2016/5/10/chartex" xmlns:cx5="http://schemas.microsoft.com/office/drawing/2016/5/11/chartex" xmlns:cx6="http://schemas.microsoft.com/office/drawing/2016/5/12/chartex" xmlns:cx7="http://schemas.microsoft.com/office/drawing/2016/5/13/chartex" xmlns:cx8="http://schemas.microsoft.com/office/drawing/2016/5/14/chartex" xmlns:mc="http://schemas.openxmlformats.org/markup-compatibility/2006" xmlns:aink="http://schemas.microsoft.com/office/drawing/2016/ink" xmlns:am3d="http://schemas.microsoft.com/office/drawing/2017/model3d" xmlns:o="urn:schemas-microsoft-com:office:office" xmlns:oel="http://schemas.microsoft.com/office/2019/extlst" xmlns:r="http://schemas.openxmlformats.org/officeDocument/2006/relationships" xmlns:m="http://schemas.openxmlformats.org/officeDocument/2006/math" xmlns:v="urn:schemas-microsoft-com:vml" xmlns:wp14="http://schemas.microsoft.com/office/word/2010/wordprocessingDrawing" xmlns:wp="http://schemas.openxmlformats.org/drawingml/2006/wordprocessingDrawing" xmlns:w10="urn:schemas-microsoft-com:office:word" xmlns:w="http://schemas.openxmlformats.org/wordprocessingml/2006/main" xmlns:w14="http://schemas.microsoft.com/office/word/2010/wordml" xmlns:w15="http://schemas.microsoft.com/office/word/2012/wordml" xmlns:w16cei="http://schemas.microsoft.com/office/word/2026/wordml/cei" xmlns:w16cex="http://schemas.microsoft.com/office/word/2018/wordml/cex" xmlns:w16cid="http://schemas.microsoft.com/office/word/2016/wordml/cid" xmlns:w16="http://schemas.microsoft.com/office/word/2018/wordml" xmlns:w16du="http://schemas.microsoft.com/office/word/2023/wordml/word16du" xmlns:w16sdtdh="http://schemas.microsoft.com/office/word/2020/wordml/sdtdatahash" xmlns:w16sdtfl="http://schemas.microsoft.com/office/word/2024/wordml/sdtformatlock" xmlns:w16se="http://schemas.microsoft.com/office/word/2015/wordml/symex" xmlns:wpg="http://schemas.microsoft.com/office/word/2010/wordprocessingGroup" xmlns:wpi="http://schemas.microsoft.com/office/word/2010/wordprocessingInk" xmlns:wne="http://schemas.microsoft.com/office/word/2006/wordml" xmlns:wps="http://schemas.microsoft.com/office/word/2010/wordprocessingShape" mc:Ignorable="w14 w15 w16se w16cid w16 w16cex w16sdtdh w16sdtfl w16du wp14">
   <w:p>
     <w:pPr>
       <w:pStyle w:val="ae"/>
     </w:pPr>
   </w:p>
 </w:hdr>
-</file>
-
-<file path=word/numbering.xml><?xml version="1.0" encoding="utf-8"?>
-<w:numbering xmlns:wpc="http://schemas.microsoft.com/office/word/2010/wordprocessingCanvas" xmlns:cx="http://schemas.microsoft.com/office/drawing/2014/chartex" xmlns:cx1="http://schemas.microsoft.com/office/drawing/2015/9/8/chartex" xmlns:cx2="http://schemas.microsoft.com/office/drawing/2015/10/21/chartex" xmlns:cx3="http://schemas.microsoft.com/office/drawing/2016/5/9/chartex" xmlns:cx4="http://schemas.microsoft.com/office/drawing/2016/5/10/chartex" xmlns:cx5="http://schemas.microsoft.com/office/drawing/2016/5/11/chartex" xmlns:cx6="http://schemas.microsoft.com/office/drawing/2016/5/12/chartex" xmlns:cx7="http://schemas.microsoft.com/office/drawing/2016/5/13/chartex" xmlns:cx8="http://schemas.microsoft.com/office/drawing/2016/5/14/chartex" xmlns:mc="http://schemas.openxmlformats.org/markup-compatibility/2006" xmlns:aink="http://schemas.microsoft.com/office/drawing/2016/ink" xmlns:am3d="http://schemas.microsoft.com/office/drawing/2017/model3d" xmlns:o="urn:schemas-microsoft-com:office:office" xmlns:oel="http://schemas.microsoft.com/office/2019/extlst" xmlns:r="http://schemas.openxmlformats.org/officeDocument/2006/relationships" xmlns:m="http://schemas.openxmlformats.org/officeDocument/2006/math" xmlns:v="urn:schemas-microsoft-com:vml" xmlns:wp14="http://schemas.microsoft.com/office/word/2010/wordprocessingDrawing" xmlns:wp="http://schemas.openxmlformats.org/drawingml/2006/wordprocessingDrawing" xmlns:w10="urn:schemas-microsoft-com:office:word" xmlns:w="http://schemas.openxmlformats.org/wordprocessingml/2006/main" xmlns:w14="http://schemas.microsoft.com/office/word/2010/wordml" xmlns:w15="http://schemas.microsoft.com/office/word/2012/wordml" xmlns:w16cex="http://schemas.microsoft.com/office/word/2018/wordml/cex" xmlns:w16cid="http://schemas.microsoft.com/office/word/2016/wordml/cid" xmlns:w16="http://schemas.microsoft.com/office/word/2018/wordml" xmlns:w16du="http://schemas.microsoft.com/office/word/2023/wordml/word16du" xmlns:w16sdtdh="http://schemas.microsoft.com/office/word/2020/wordml/sdtdatahash" xmlns:w16sdtfl="http://schemas.microsoft.com/office/word/2024/wordml/sdtformatlock" xmlns:w16se="http://schemas.microsoft.com/office/word/2015/wordml/symex" xmlns:wpg="http://schemas.microsoft.com/office/word/2010/wordprocessingGroup" xmlns:wpi="http://schemas.microsoft.com/office/word/2010/wordprocessingInk" xmlns:wne="http://schemas.microsoft.com/office/word/2006/wordml" xmlns:wps="http://schemas.microsoft.com/office/word/2010/wordprocessingShape" mc:Ignorable="w14 w15 w16se w16cid w16 w16cex w16sdtdh w16sdtfl w16du wp14">
-  <w:abstractNum w:abstractNumId="0" w15:restartNumberingAfterBreak="0">
-    <w:nsid w:val="59EA293C"/>
-    <w:multiLevelType w:val="hybridMultilevel"/>
-    <w:tmpl w:val="3A122D6E"/>
-    <w:lvl w:ilvl="0" w:tplc="E78A5D42">
-      <w:start w:val="1"/>
-      <w:numFmt w:val="decimal"/>
-      <w:lvlText w:val="%1."/>
-      <w:lvlJc w:val="left"/>
-      <w:pPr>
-        <w:ind w:left="360" w:hanging="360"/>
-      </w:pPr>
-      <w:rPr>
-        <w:rFonts w:hint="default"/>
-      </w:rPr>
-    </w:lvl>
-    <w:lvl w:ilvl="1" w:tplc="04090019" w:tentative="1">
-      <w:start w:val="1"/>
-      <w:numFmt w:val="lowerLetter"/>
-      <w:lvlText w:val="%2)"/>
-      <w:lvlJc w:val="left"/>
-      <w:pPr>
-        <w:ind w:left="880" w:hanging="440"/>
-      </w:pPr>
-    </w:lvl>
-    <w:lvl w:ilvl="2" w:tplc="0409001B" w:tentative="1">
-      <w:start w:val="1"/>
-      <w:numFmt w:val="lowerRoman"/>
-      <w:lvlText w:val="%3."/>
-      <w:lvlJc w:val="right"/>
-      <w:pPr>
-        <w:ind w:left="1320" w:hanging="440"/>
-      </w:pPr>
-    </w:lvl>
-    <w:lvl w:ilvl="3" w:tplc="0409000F" w:tentative="1">
-      <w:start w:val="1"/>
-      <w:numFmt w:val="decimal"/>
-      <w:lvlText w:val="%4."/>
-      <w:lvlJc w:val="left"/>
-      <w:pPr>
-        <w:ind w:left="1760" w:hanging="440"/>
-      </w:pPr>
-    </w:lvl>
-    <w:lvl w:ilvl="4" w:tplc="04090019" w:tentative="1">
-      <w:start w:val="1"/>
-      <w:numFmt w:val="lowerLetter"/>
-      <w:lvlText w:val="%5)"/>
-      <w:lvlJc w:val="left"/>
-      <w:pPr>
-        <w:ind w:left="2200" w:hanging="440"/>
-      </w:pPr>
-    </w:lvl>
-    <w:lvl w:ilvl="5" w:tplc="0409001B" w:tentative="1">
-      <w:start w:val="1"/>
-      <w:numFmt w:val="lowerRoman"/>
-      <w:lvlText w:val="%6."/>
-      <w:lvlJc w:val="right"/>
-      <w:pPr>
-        <w:ind w:left="2640" w:hanging="440"/>
-      </w:pPr>
-    </w:lvl>
-    <w:lvl w:ilvl="6" w:tplc="0409000F" w:tentative="1">
-      <w:start w:val="1"/>
-      <w:numFmt w:val="decimal"/>
-      <w:lvlText w:val="%7."/>
-      <w:lvlJc w:val="left"/>
-      <w:pPr>
-        <w:ind w:left="3080" w:hanging="440"/>
-      </w:pPr>
-    </w:lvl>
-    <w:lvl w:ilvl="7" w:tplc="04090019" w:tentative="1">
-      <w:start w:val="1"/>
-      <w:numFmt w:val="lowerLetter"/>
-      <w:lvlText w:val="%8)"/>
-      <w:lvlJc w:val="left"/>
-      <w:pPr>
-        <w:ind w:left="3520" w:hanging="440"/>
-      </w:pPr>
-    </w:lvl>
-    <w:lvl w:ilvl="8" w:tplc="0409001B" w:tentative="1">
-      <w:start w:val="1"/>
-      <w:numFmt w:val="lowerRoman"/>
-      <w:lvlText w:val="%9."/>
-      <w:lvlJc w:val="right"/>
-      <w:pPr>
-        <w:ind w:left="3960" w:hanging="440"/>
-      </w:pPr>
-    </w:lvl>
-  </w:abstractNum>
-  <w:abstractNum w:abstractNumId="1" w15:restartNumberingAfterBreak="0">
-    <w:nsid w:val="629779E7"/>
-    <w:multiLevelType w:val="multilevel"/>
-    <w:tmpl w:val="B5E0086C"/>
-    <w:lvl w:ilvl="0">
-      <w:start w:val="1"/>
-      <w:numFmt w:val="decimal"/>
-      <w:lvlText w:val="%1."/>
-      <w:lvlJc w:val="left"/>
-      <w:pPr>
-        <w:tabs>
-          <w:tab w:val="num" w:pos="720"/>
-        </w:tabs>
-        <w:ind w:left="720" w:hanging="360"/>
-      </w:pPr>
-    </w:lvl>
-    <w:lvl w:ilvl="1" w:tentative="1">
-      <w:start w:val="1"/>
-      <w:numFmt w:val="decimal"/>
-      <w:lvlText w:val="%2."/>
-      <w:lvlJc w:val="left"/>
-      <w:pPr>
-        <w:tabs>
-          <w:tab w:val="num" w:pos="1440"/>
-        </w:tabs>
-        <w:ind w:left="1440" w:hanging="360"/>
-      </w:pPr>
-    </w:lvl>
-    <w:lvl w:ilvl="2" w:tentative="1">
-      <w:start w:val="1"/>
-      <w:numFmt w:val="decimal"/>
-      <w:lvlText w:val="%3."/>
-      <w:lvlJc w:val="left"/>
-      <w:pPr>
-        <w:tabs>
-          <w:tab w:val="num" w:pos="2160"/>
-        </w:tabs>
-        <w:ind w:left="2160" w:hanging="360"/>
-      </w:pPr>
-    </w:lvl>
-    <w:lvl w:ilvl="3" w:tentative="1">
-      <w:start w:val="1"/>
-      <w:numFmt w:val="decimal"/>
-      <w:lvlText w:val="%4."/>
-      <w:lvlJc w:val="left"/>
-      <w:pPr>
-        <w:tabs>
-          <w:tab w:val="num" w:pos="2880"/>
-        </w:tabs>
-        <w:ind w:left="2880" w:hanging="360"/>
-      </w:pPr>
-    </w:lvl>
-    <w:lvl w:ilvl="4" w:tentative="1">
-      <w:start w:val="1"/>
-      <w:numFmt w:val="decimal"/>
-      <w:lvlText w:val="%5."/>
-      <w:lvlJc w:val="left"/>
-      <w:pPr>
-        <w:tabs>
-          <w:tab w:val="num" w:pos="3600"/>
-        </w:tabs>
-        <w:ind w:left="3600" w:hanging="360"/>
-      </w:pPr>
-    </w:lvl>
-    <w:lvl w:ilvl="5" w:tentative="1">
-      <w:start w:val="1"/>
-      <w:numFmt w:val="decimal"/>
-      <w:lvlText w:val="%6."/>
-      <w:lvlJc w:val="left"/>
-      <w:pPr>
-        <w:tabs>
-          <w:tab w:val="num" w:pos="4320"/>
-        </w:tabs>
-        <w:ind w:left="4320" w:hanging="360"/>
-      </w:pPr>
-    </w:lvl>
-    <w:lvl w:ilvl="6" w:tentative="1">
-      <w:start w:val="1"/>
-      <w:numFmt w:val="decimal"/>
-      <w:lvlText w:val="%7."/>
-      <w:lvlJc w:val="left"/>
-      <w:pPr>
-        <w:tabs>
-          <w:tab w:val="num" w:pos="5040"/>
-        </w:tabs>
-        <w:ind w:left="5040" w:hanging="360"/>
-      </w:pPr>
-    </w:lvl>
-    <w:lvl w:ilvl="7" w:tentative="1">
-      <w:start w:val="1"/>
-      <w:numFmt w:val="decimal"/>
-      <w:lvlText w:val="%8."/>
-      <w:lvlJc w:val="left"/>
-      <w:pPr>
-        <w:tabs>
-          <w:tab w:val="num" w:pos="5760"/>
-        </w:tabs>
-        <w:ind w:left="5760" w:hanging="360"/>
-      </w:pPr>
-    </w:lvl>
-    <w:lvl w:ilvl="8" w:tentative="1">
-      <w:start w:val="1"/>
-      <w:numFmt w:val="decimal"/>
-      <w:lvlText w:val="%9."/>
-      <w:lvlJc w:val="left"/>
-      <w:pPr>
-        <w:tabs>
-          <w:tab w:val="num" w:pos="6480"/>
-        </w:tabs>
-        <w:ind w:left="6480" w:hanging="360"/>
-      </w:pPr>
-    </w:lvl>
-  </w:abstractNum>
-  <w:abstractNum w:abstractNumId="2" w15:restartNumberingAfterBreak="0">
-    <w:nsid w:val="6B6C4CB0"/>
-    <w:multiLevelType w:val="multilevel"/>
-    <w:tmpl w:val="62DAA98A"/>
-    <w:lvl w:ilvl="0">
-      <w:start w:val="1"/>
-      <w:numFmt w:val="decimal"/>
-      <w:lvlText w:val="%1."/>
-      <w:lvlJc w:val="left"/>
-      <w:pPr>
-        <w:tabs>
-          <w:tab w:val="num" w:pos="720"/>
-        </w:tabs>
-        <w:ind w:left="720" w:hanging="360"/>
-      </w:pPr>
-    </w:lvl>
-    <w:lvl w:ilvl="1" w:tentative="1">
-      <w:start w:val="1"/>
-      <w:numFmt w:val="decimal"/>
-      <w:lvlText w:val="%2."/>
-      <w:lvlJc w:val="left"/>
-      <w:pPr>
-        <w:tabs>
-          <w:tab w:val="num" w:pos="1440"/>
-        </w:tabs>
-        <w:ind w:left="1440" w:hanging="360"/>
-      </w:pPr>
-    </w:lvl>
-    <w:lvl w:ilvl="2" w:tentative="1">
-      <w:start w:val="1"/>
-      <w:numFmt w:val="decimal"/>
-      <w:lvlText w:val="%3."/>
-      <w:lvlJc w:val="left"/>
-      <w:pPr>
-        <w:tabs>
-          <w:tab w:val="num" w:pos="2160"/>
-        </w:tabs>
-        <w:ind w:left="2160" w:hanging="360"/>
-      </w:pPr>
-    </w:lvl>
-    <w:lvl w:ilvl="3" w:tentative="1">
-      <w:start w:val="1"/>
-      <w:numFmt w:val="decimal"/>
-      <w:lvlText w:val="%4."/>
-      <w:lvlJc w:val="left"/>
-      <w:pPr>
-        <w:tabs>
-          <w:tab w:val="num" w:pos="2880"/>
-        </w:tabs>
-        <w:ind w:left="2880" w:hanging="360"/>
-      </w:pPr>
-    </w:lvl>
-    <w:lvl w:ilvl="4" w:tentative="1">
-      <w:start w:val="1"/>
-      <w:numFmt w:val="decimal"/>
-      <w:lvlText w:val="%5."/>
-      <w:lvlJc w:val="left"/>
-      <w:pPr>
-        <w:tabs>
-          <w:tab w:val="num" w:pos="3600"/>
-        </w:tabs>
-        <w:ind w:left="3600" w:hanging="360"/>
-      </w:pPr>
-    </w:lvl>
-    <w:lvl w:ilvl="5" w:tentative="1">
-      <w:start w:val="1"/>
-      <w:numFmt w:val="decimal"/>
-      <w:lvlText w:val="%6."/>
-      <w:lvlJc w:val="left"/>
-      <w:pPr>
-        <w:tabs>
-          <w:tab w:val="num" w:pos="4320"/>
-        </w:tabs>
-        <w:ind w:left="4320" w:hanging="360"/>
-      </w:pPr>
-    </w:lvl>
-    <w:lvl w:ilvl="6" w:tentative="1">
-      <w:start w:val="1"/>
-      <w:numFmt w:val="decimal"/>
-      <w:lvlText w:val="%7."/>
-      <w:lvlJc w:val="left"/>
-      <w:pPr>
-        <w:tabs>
-          <w:tab w:val="num" w:pos="5040"/>
-        </w:tabs>
-        <w:ind w:left="5040" w:hanging="360"/>
-      </w:pPr>
-    </w:lvl>
-    <w:lvl w:ilvl="7" w:tentative="1">
-      <w:start w:val="1"/>
-      <w:numFmt w:val="decimal"/>
-      <w:lvlText w:val="%8."/>
-      <w:lvlJc w:val="left"/>
-      <w:pPr>
-        <w:tabs>
-          <w:tab w:val="num" w:pos="5760"/>
-        </w:tabs>
-        <w:ind w:left="5760" w:hanging="360"/>
-      </w:pPr>
-    </w:lvl>
-    <w:lvl w:ilvl="8" w:tentative="1">
-      <w:start w:val="1"/>
-      <w:numFmt w:val="decimal"/>
-      <w:lvlText w:val="%9."/>
-      <w:lvlJc w:val="left"/>
-      <w:pPr>
-        <w:tabs>
-          <w:tab w:val="num" w:pos="6480"/>
-        </w:tabs>
-        <w:ind w:left="6480" w:hanging="360"/>
-      </w:pPr>
-    </w:lvl>
-  </w:abstractNum>
-  <w:abstractNum w:abstractNumId="3" w15:restartNumberingAfterBreak="0">
-    <w:nsid w:val="6B876159"/>
-    <w:multiLevelType w:val="multilevel"/>
-    <w:tmpl w:val="A7F88780"/>
-    <w:lvl w:ilvl="0">
-      <w:start w:val="1"/>
-      <w:numFmt w:val="decimal"/>
-      <w:lvlText w:val="%1."/>
-      <w:lvlJc w:val="left"/>
-      <w:pPr>
-        <w:tabs>
-          <w:tab w:val="num" w:pos="720"/>
-        </w:tabs>
-        <w:ind w:left="720" w:hanging="360"/>
-      </w:pPr>
-    </w:lvl>
-    <w:lvl w:ilvl="1" w:tentative="1">
-      <w:start w:val="1"/>
-      <w:numFmt w:val="decimal"/>
-      <w:lvlText w:val="%2."/>
-      <w:lvlJc w:val="left"/>
-      <w:pPr>
-        <w:tabs>
-          <w:tab w:val="num" w:pos="1440"/>
-        </w:tabs>
-        <w:ind w:left="1440" w:hanging="360"/>
-      </w:pPr>
-    </w:lvl>
-    <w:lvl w:ilvl="2" w:tentative="1">
-      <w:start w:val="1"/>
-      <w:numFmt w:val="decimal"/>
-      <w:lvlText w:val="%3."/>
-      <w:lvlJc w:val="left"/>
-      <w:pPr>
-        <w:tabs>
-          <w:tab w:val="num" w:pos="2160"/>
-        </w:tabs>
-        <w:ind w:left="2160" w:hanging="360"/>
-      </w:pPr>
-    </w:lvl>
-    <w:lvl w:ilvl="3" w:tentative="1">
-      <w:start w:val="1"/>
-      <w:numFmt w:val="decimal"/>
-      <w:lvlText w:val="%4."/>
-      <w:lvlJc w:val="left"/>
-      <w:pPr>
-        <w:tabs>
-          <w:tab w:val="num" w:pos="2880"/>
-        </w:tabs>
-        <w:ind w:left="2880" w:hanging="360"/>
-      </w:pPr>
-    </w:lvl>
-    <w:lvl w:ilvl="4" w:tentative="1">
-      <w:start w:val="1"/>
-      <w:numFmt w:val="decimal"/>
-      <w:lvlText w:val="%5."/>
-      <w:lvlJc w:val="left"/>
-      <w:pPr>
-        <w:tabs>
-          <w:tab w:val="num" w:pos="3600"/>
-        </w:tabs>
-        <w:ind w:left="3600" w:hanging="360"/>
-      </w:pPr>
-    </w:lvl>
-    <w:lvl w:ilvl="5" w:tentative="1">
-      <w:start w:val="1"/>
-      <w:numFmt w:val="decimal"/>
-      <w:lvlText w:val="%6."/>
-      <w:lvlJc w:val="left"/>
-      <w:pPr>
-        <w:tabs>
-          <w:tab w:val="num" w:pos="4320"/>
-        </w:tabs>
-        <w:ind w:left="4320" w:hanging="360"/>
-      </w:pPr>
-    </w:lvl>
-    <w:lvl w:ilvl="6" w:tentative="1">
-      <w:start w:val="1"/>
-      <w:numFmt w:val="decimal"/>
-      <w:lvlText w:val="%7."/>
-      <w:lvlJc w:val="left"/>
-      <w:pPr>
-        <w:tabs>
-          <w:tab w:val="num" w:pos="5040"/>
-        </w:tabs>
-        <w:ind w:left="5040" w:hanging="360"/>
-      </w:pPr>
-    </w:lvl>
-    <w:lvl w:ilvl="7" w:tentative="1">
-      <w:start w:val="1"/>
-      <w:numFmt w:val="decimal"/>
-      <w:lvlText w:val="%8."/>
-      <w:lvlJc w:val="left"/>
-      <w:pPr>
-        <w:tabs>
-          <w:tab w:val="num" w:pos="5760"/>
-        </w:tabs>
-        <w:ind w:left="5760" w:hanging="360"/>
-      </w:pPr>
-    </w:lvl>
-    <w:lvl w:ilvl="8" w:tentative="1">
-      <w:start w:val="1"/>
-      <w:numFmt w:val="decimal"/>
-      <w:lvlText w:val="%9."/>
-      <w:lvlJc w:val="left"/>
-      <w:pPr>
-        <w:tabs>
-          <w:tab w:val="num" w:pos="6480"/>
-        </w:tabs>
-        <w:ind w:left="6480" w:hanging="360"/>
-      </w:pPr>
-    </w:lvl>
-  </w:abstractNum>
-  <w:abstractNum w:abstractNumId="4" w15:restartNumberingAfterBreak="0">
-    <w:nsid w:val="70652079"/>
-    <w:multiLevelType w:val="multilevel"/>
-    <w:tmpl w:val="E8162FC8"/>
-    <w:lvl w:ilvl="0">
-      <w:start w:val="1"/>
-      <w:numFmt w:val="decimal"/>
-      <w:lvlText w:val="%1."/>
-      <w:lvlJc w:val="left"/>
-      <w:pPr>
-        <w:tabs>
-          <w:tab w:val="num" w:pos="720"/>
-        </w:tabs>
-        <w:ind w:left="720" w:hanging="360"/>
-      </w:pPr>
-    </w:lvl>
-    <w:lvl w:ilvl="1" w:tentative="1">
-      <w:start w:val="1"/>
-      <w:numFmt w:val="decimal"/>
-      <w:lvlText w:val="%2."/>
-      <w:lvlJc w:val="left"/>
-      <w:pPr>
-        <w:tabs>
-          <w:tab w:val="num" w:pos="1440"/>
-        </w:tabs>
-        <w:ind w:left="1440" w:hanging="360"/>
-      </w:pPr>
-    </w:lvl>
-    <w:lvl w:ilvl="2" w:tentative="1">
-      <w:start w:val="1"/>
-      <w:numFmt w:val="decimal"/>
-      <w:lvlText w:val="%3."/>
-      <w:lvlJc w:val="left"/>
-      <w:pPr>
-        <w:tabs>
-          <w:tab w:val="num" w:pos="2160"/>
-        </w:tabs>
-        <w:ind w:left="2160" w:hanging="360"/>
-      </w:pPr>
-    </w:lvl>
-    <w:lvl w:ilvl="3" w:tentative="1">
-      <w:start w:val="1"/>
-      <w:numFmt w:val="decimal"/>
-      <w:lvlText w:val="%4."/>
-      <w:lvlJc w:val="left"/>
-      <w:pPr>
-        <w:tabs>
-          <w:tab w:val="num" w:pos="2880"/>
-        </w:tabs>
-        <w:ind w:left="2880" w:hanging="360"/>
-      </w:pPr>
-    </w:lvl>
-    <w:lvl w:ilvl="4" w:tentative="1">
-      <w:start w:val="1"/>
-      <w:numFmt w:val="decimal"/>
-      <w:lvlText w:val="%5."/>
-      <w:lvlJc w:val="left"/>
-      <w:pPr>
-        <w:tabs>
-          <w:tab w:val="num" w:pos="3600"/>
-        </w:tabs>
-        <w:ind w:left="3600" w:hanging="360"/>
-      </w:pPr>
-    </w:lvl>
-    <w:lvl w:ilvl="5" w:tentative="1">
-      <w:start w:val="1"/>
-      <w:numFmt w:val="decimal"/>
-      <w:lvlText w:val="%6."/>
-      <w:lvlJc w:val="left"/>
-      <w:pPr>
-        <w:tabs>
-          <w:tab w:val="num" w:pos="4320"/>
-        </w:tabs>
-        <w:ind w:left="4320" w:hanging="360"/>
-      </w:pPr>
-    </w:lvl>
-    <w:lvl w:ilvl="6" w:tentative="1">
-      <w:start w:val="1"/>
-      <w:numFmt w:val="decimal"/>
-      <w:lvlText w:val="%7."/>
-      <w:lvlJc w:val="left"/>
-      <w:pPr>
-        <w:tabs>
-          <w:tab w:val="num" w:pos="5040"/>
-        </w:tabs>
-        <w:ind w:left="5040" w:hanging="360"/>
-      </w:pPr>
-    </w:lvl>
-    <w:lvl w:ilvl="7" w:tentative="1">
-      <w:start w:val="1"/>
-      <w:numFmt w:val="decimal"/>
-      <w:lvlText w:val="%8."/>
-      <w:lvlJc w:val="left"/>
-      <w:pPr>
-        <w:tabs>
-          <w:tab w:val="num" w:pos="5760"/>
-        </w:tabs>
-        <w:ind w:left="5760" w:hanging="360"/>
-      </w:pPr>
-    </w:lvl>
-    <w:lvl w:ilvl="8" w:tentative="1">
-      <w:start w:val="1"/>
-      <w:numFmt w:val="decimal"/>
-      <w:lvlText w:val="%9."/>
-      <w:lvlJc w:val="left"/>
-      <w:pPr>
-        <w:tabs>
-          <w:tab w:val="num" w:pos="6480"/>
-        </w:tabs>
-        <w:ind w:left="6480" w:hanging="360"/>
-      </w:pPr>
-    </w:lvl>
-  </w:abstractNum>
-  <w:num w:numId="1" w16cid:durableId="1827821018">
-    <w:abstractNumId w:val="3"/>
-  </w:num>
-  <w:num w:numId="2" w16cid:durableId="859052533">
-    <w:abstractNumId w:val="1"/>
-  </w:num>
-  <w:num w:numId="3" w16cid:durableId="1118525484">
-    <w:abstractNumId w:val="4"/>
-  </w:num>
-  <w:num w:numId="4" w16cid:durableId="1281185807">
-    <w:abstractNumId w:val="2"/>
-  </w:num>
-  <w:num w:numId="5" w16cid:durableId="168251670">
-    <w:abstractNumId w:val="0"/>
-  </w:num>
-</w:numbering>
 </file>
 
 <file path=word/styles.xml><?xml version="1.0" encoding="utf-8"?>
@@ -1618,7 +804,7 @@
     <w:link w:val="10"/>
     <w:uiPriority w:val="9"/>
     <w:qFormat/>
-    <w:rsid w:val="007D4E5E"/>
+    <w:rsid w:val="0033350A"/>
     <w:pPr>
       <w:keepNext/>
       <w:keepLines/>
@@ -1641,7 +827,7 @@
     <w:semiHidden/>
     <w:unhideWhenUsed/>
     <w:qFormat/>
-    <w:rsid w:val="007D4E5E"/>
+    <w:rsid w:val="0033350A"/>
     <w:pPr>
       <w:keepNext/>
       <w:keepLines/>
@@ -1664,7 +850,7 @@
     <w:semiHidden/>
     <w:unhideWhenUsed/>
     <w:qFormat/>
-    <w:rsid w:val="007D4E5E"/>
+    <w:rsid w:val="0033350A"/>
     <w:pPr>
       <w:keepNext/>
       <w:keepLines/>
@@ -1687,7 +873,7 @@
     <w:semiHidden/>
     <w:unhideWhenUsed/>
     <w:qFormat/>
-    <w:rsid w:val="007D4E5E"/>
+    <w:rsid w:val="0033350A"/>
     <w:pPr>
       <w:keepNext/>
       <w:keepLines/>
@@ -1710,7 +896,7 @@
     <w:semiHidden/>
     <w:unhideWhenUsed/>
     <w:qFormat/>
-    <w:rsid w:val="007D4E5E"/>
+    <w:rsid w:val="0033350A"/>
     <w:pPr>
       <w:keepNext/>
       <w:keepLines/>
@@ -1732,7 +918,7 @@
     <w:semiHidden/>
     <w:unhideWhenUsed/>
     <w:qFormat/>
-    <w:rsid w:val="007D4E5E"/>
+    <w:rsid w:val="0033350A"/>
     <w:pPr>
       <w:keepNext/>
       <w:keepLines/>
@@ -1755,7 +941,7 @@
     <w:semiHidden/>
     <w:unhideWhenUsed/>
     <w:qFormat/>
-    <w:rsid w:val="007D4E5E"/>
+    <w:rsid w:val="0033350A"/>
     <w:pPr>
       <w:keepNext/>
       <w:keepLines/>
@@ -1778,7 +964,7 @@
     <w:semiHidden/>
     <w:unhideWhenUsed/>
     <w:qFormat/>
-    <w:rsid w:val="007D4E5E"/>
+    <w:rsid w:val="0033350A"/>
     <w:pPr>
       <w:keepNext/>
       <w:keepLines/>
@@ -1799,7 +985,7 @@
     <w:semiHidden/>
     <w:unhideWhenUsed/>
     <w:qFormat/>
-    <w:rsid w:val="007D4E5E"/>
+    <w:rsid w:val="0033350A"/>
     <w:pPr>
       <w:keepNext/>
       <w:keepLines/>
@@ -1843,7 +1029,7 @@
     <w:basedOn w:val="a0"/>
     <w:link w:val="1"/>
     <w:uiPriority w:val="9"/>
-    <w:rsid w:val="007D4E5E"/>
+    <w:rsid w:val="0033350A"/>
     <w:rPr>
       <w:rFonts w:asciiTheme="majorHAnsi" w:eastAsiaTheme="majorEastAsia" w:hAnsiTheme="majorHAnsi" w:cstheme="majorBidi"/>
       <w:color w:val="0F4761" w:themeColor="accent1" w:themeShade="BF"/>
@@ -1857,7 +1043,7 @@
     <w:link w:val="2"/>
     <w:uiPriority w:val="9"/>
     <w:semiHidden/>
-    <w:rsid w:val="007D4E5E"/>
+    <w:rsid w:val="0033350A"/>
     <w:rPr>
       <w:rFonts w:asciiTheme="majorHAnsi" w:eastAsiaTheme="majorEastAsia" w:hAnsiTheme="majorHAnsi" w:cstheme="majorBidi"/>
       <w:color w:val="0F4761" w:themeColor="accent1" w:themeShade="BF"/>
@@ -1871,7 +1057,7 @@
     <w:link w:val="3"/>
     <w:uiPriority w:val="9"/>
     <w:semiHidden/>
-    <w:rsid w:val="007D4E5E"/>
+    <w:rsid w:val="0033350A"/>
     <w:rPr>
       <w:rFonts w:asciiTheme="majorHAnsi" w:eastAsiaTheme="majorEastAsia" w:hAnsiTheme="majorHAnsi" w:cstheme="majorBidi"/>
       <w:color w:val="0F4761" w:themeColor="accent1" w:themeShade="BF"/>
@@ -1885,7 +1071,7 @@
     <w:link w:val="4"/>
     <w:uiPriority w:val="9"/>
     <w:semiHidden/>
-    <w:rsid w:val="007D4E5E"/>
+    <w:rsid w:val="0033350A"/>
     <w:rPr>
       <w:rFonts w:cstheme="majorBidi"/>
       <w:color w:val="0F4761" w:themeColor="accent1" w:themeShade="BF"/>
@@ -1899,7 +1085,7 @@
     <w:link w:val="5"/>
     <w:uiPriority w:val="9"/>
     <w:semiHidden/>
-    <w:rsid w:val="007D4E5E"/>
+    <w:rsid w:val="0033350A"/>
     <w:rPr>
       <w:rFonts w:cstheme="majorBidi"/>
       <w:color w:val="0F4761" w:themeColor="accent1" w:themeShade="BF"/>
@@ -1912,7 +1098,7 @@
     <w:link w:val="6"/>
     <w:uiPriority w:val="9"/>
     <w:semiHidden/>
-    <w:rsid w:val="007D4E5E"/>
+    <w:rsid w:val="0033350A"/>
     <w:rPr>
       <w:rFonts w:cstheme="majorBidi"/>
       <w:b/>
@@ -1926,7 +1112,7 @@
     <w:link w:val="7"/>
     <w:uiPriority w:val="9"/>
     <w:semiHidden/>
-    <w:rsid w:val="007D4E5E"/>
+    <w:rsid w:val="0033350A"/>
     <w:rPr>
       <w:rFonts w:cstheme="majorBidi"/>
       <w:b/>
@@ -1940,7 +1126,7 @@
     <w:link w:val="8"/>
     <w:uiPriority w:val="9"/>
     <w:semiHidden/>
-    <w:rsid w:val="007D4E5E"/>
+    <w:rsid w:val="0033350A"/>
     <w:rPr>
       <w:rFonts w:cstheme="majorBidi"/>
       <w:color w:val="595959" w:themeColor="text1" w:themeTint="A6"/>
@@ -1952,7 +1138,7 @@
     <w:link w:val="9"/>
     <w:uiPriority w:val="9"/>
     <w:semiHidden/>
-    <w:rsid w:val="007D4E5E"/>
+    <w:rsid w:val="0033350A"/>
     <w:rPr>
       <w:rFonts w:eastAsiaTheme="majorEastAsia" w:cstheme="majorBidi"/>
       <w:color w:val="595959" w:themeColor="text1" w:themeTint="A6"/>
@@ -1965,7 +1151,7 @@
     <w:link w:val="a4"/>
     <w:uiPriority w:val="10"/>
     <w:qFormat/>
-    <w:rsid w:val="007D4E5E"/>
+    <w:rsid w:val="0033350A"/>
     <w:pPr>
       <w:spacing w:after="80" w:line="240" w:lineRule="auto"/>
       <w:contextualSpacing/>
@@ -1984,7 +1170,7 @@
     <w:basedOn w:val="a0"/>
     <w:link w:val="a3"/>
     <w:uiPriority w:val="10"/>
-    <w:rsid w:val="007D4E5E"/>
+    <w:rsid w:val="0033350A"/>
     <w:rPr>
       <w:rFonts w:asciiTheme="majorHAnsi" w:eastAsiaTheme="majorEastAsia" w:hAnsiTheme="majorHAnsi" w:cstheme="majorBidi"/>
       <w:spacing w:val="-10"/>
@@ -2000,7 +1186,7 @@
     <w:link w:val="a6"/>
     <w:uiPriority w:val="11"/>
     <w:qFormat/>
-    <w:rsid w:val="007D4E5E"/>
+    <w:rsid w:val="0033350A"/>
     <w:pPr>
       <w:numPr>
         <w:ilvl w:val="1"/>
@@ -2020,7 +1206,7 @@
     <w:basedOn w:val="a0"/>
     <w:link w:val="a5"/>
     <w:uiPriority w:val="11"/>
-    <w:rsid w:val="007D4E5E"/>
+    <w:rsid w:val="0033350A"/>
     <w:rPr>
       <w:rFonts w:asciiTheme="majorHAnsi" w:eastAsiaTheme="majorEastAsia" w:hAnsiTheme="majorHAnsi" w:cstheme="majorBidi"/>
       <w:color w:val="595959" w:themeColor="text1" w:themeTint="A6"/>
@@ -2036,7 +1222,7 @@
     <w:link w:val="a8"/>
     <w:uiPriority w:val="29"/>
     <w:qFormat/>
-    <w:rsid w:val="007D4E5E"/>
+    <w:rsid w:val="0033350A"/>
     <w:pPr>
       <w:spacing w:before="160"/>
       <w:jc w:val="center"/>
@@ -2052,7 +1238,7 @@
     <w:basedOn w:val="a0"/>
     <w:link w:val="a7"/>
     <w:uiPriority w:val="29"/>
-    <w:rsid w:val="007D4E5E"/>
+    <w:rsid w:val="0033350A"/>
     <w:rPr>
       <w:i/>
       <w:iCs/>
@@ -2064,7 +1250,7 @@
     <w:basedOn w:val="a"/>
     <w:uiPriority w:val="34"/>
     <w:qFormat/>
-    <w:rsid w:val="007D4E5E"/>
+    <w:rsid w:val="0033350A"/>
     <w:pPr>
       <w:ind w:left="720"/>
       <w:contextualSpacing/>
@@ -2075,7 +1261,7 @@
     <w:basedOn w:val="a0"/>
     <w:uiPriority w:val="21"/>
     <w:qFormat/>
-    <w:rsid w:val="007D4E5E"/>
+    <w:rsid w:val="0033350A"/>
     <w:rPr>
       <w:i/>
       <w:iCs/>
@@ -2089,7 +1275,7 @@
     <w:link w:val="ac"/>
     <w:uiPriority w:val="30"/>
     <w:qFormat/>
-    <w:rsid w:val="007D4E5E"/>
+    <w:rsid w:val="0033350A"/>
     <w:pPr>
       <w:pBdr>
         <w:top w:val="single" w:sz="4" w:space="10" w:color="0F4761" w:themeColor="accent1" w:themeShade="BF"/>
@@ -2110,7 +1296,7 @@
     <w:basedOn w:val="a0"/>
     <w:link w:val="ab"/>
     <w:uiPriority w:val="30"/>
-    <w:rsid w:val="007D4E5E"/>
+    <w:rsid w:val="0033350A"/>
     <w:rPr>
       <w:i/>
       <w:iCs/>
@@ -2122,7 +1308,7 @@
     <w:basedOn w:val="a0"/>
     <w:uiPriority w:val="32"/>
     <w:qFormat/>
-    <w:rsid w:val="007D4E5E"/>
+    <w:rsid w:val="0033350A"/>
     <w:rPr>
       <w:b/>
       <w:bCs/>
@@ -2137,7 +1323,7 @@
     <w:link w:val="af"/>
     <w:uiPriority w:val="99"/>
     <w:unhideWhenUsed/>
-    <w:rsid w:val="007D4E5E"/>
+    <w:rsid w:val="0033350A"/>
     <w:pPr>
       <w:tabs>
         <w:tab w:val="center" w:pos="4153"/>
@@ -2157,7 +1343,7 @@
     <w:basedOn w:val="a0"/>
     <w:link w:val="ae"/>
     <w:uiPriority w:val="99"/>
-    <w:rsid w:val="007D4E5E"/>
+    <w:rsid w:val="0033350A"/>
     <w:rPr>
       <w:sz w:val="18"/>
       <w:szCs w:val="18"/>
@@ -2169,7 +1355,7 @@
     <w:link w:val="af1"/>
     <w:uiPriority w:val="99"/>
     <w:unhideWhenUsed/>
-    <w:rsid w:val="007D4E5E"/>
+    <w:rsid w:val="0033350A"/>
     <w:pPr>
       <w:tabs>
         <w:tab w:val="center" w:pos="4153"/>
@@ -2188,7 +1374,7 @@
     <w:basedOn w:val="a0"/>
     <w:link w:val="af0"/>
     <w:uiPriority w:val="99"/>
-    <w:rsid w:val="007D4E5E"/>
+    <w:rsid w:val="0033350A"/>
     <w:rPr>
       <w:sz w:val="18"/>
       <w:szCs w:val="18"/>
@@ -2513,8 +1699,8 @@
 </file>
 
 <file path=customXml/item1.xml><?xml version="1.0" encoding="utf-8"?>
-<ct:contentTypeSchema xmlns:ct="http://schemas.microsoft.com/office/2006/metadata/contentType" xmlns:ma="http://schemas.microsoft.com/office/2006/metadata/properties/metaAttributes" ct:_="" ma:_="" ma:contentTypeName="文档" ma:contentTypeID="0x010100D7463188071CC94B911D3340E8E0C62C" ma:contentTypeVersion="11" ma:contentTypeDescription="新建文档。" ma:contentTypeScope="" ma:versionID="46ffc49ad777a8e05f3869df8ab7b605">
-  <xsd:schema xmlns:xsd="http://www.w3.org/2001/XMLSchema" xmlns:xs="http://www.w3.org/2001/XMLSchema" xmlns:p="http://schemas.microsoft.com/office/2006/metadata/properties" xmlns:ns2="8d121481-1a79-4b27-8ea4-88b381fe8530" xmlns:ns3="5dd3440f-b559-442b-b92f-64cc2a98c0a1" targetNamespace="http://schemas.microsoft.com/office/2006/metadata/properties" ma:root="true" ma:fieldsID="0c9cbc57a641b77000a2ef0495f824ee" ns2:_="" ns3:_="">
+<ct:contentTypeSchema xmlns:ct="http://schemas.microsoft.com/office/2006/metadata/contentType" xmlns:ma="http://schemas.microsoft.com/office/2006/metadata/properties/metaAttributes" ct:_="" ma:_="" ma:contentTypeName="Document" ma:contentTypeID="0x010100D7463188071CC94B911D3340E8E0C62C" ma:contentTypeVersion="11" ma:contentTypeDescription="Create a new document." ma:contentTypeScope="" ma:versionID="5ce410c4a9196b583a4e620c5d593282">
+  <xsd:schema xmlns:xsd="http://www.w3.org/2001/XMLSchema" xmlns:xs="http://www.w3.org/2001/XMLSchema" xmlns:p="http://schemas.microsoft.com/office/2006/metadata/properties" xmlns:ns2="8d121481-1a79-4b27-8ea4-88b381fe8530" xmlns:ns3="5dd3440f-b559-442b-b92f-64cc2a98c0a1" targetNamespace="http://schemas.microsoft.com/office/2006/metadata/properties" ma:root="true" ma:fieldsID="1f4be5d7ef1b48080deb6ad343d852a5" ns2:_="" ns3:_="">
     <xsd:import namespace="8d121481-1a79-4b27-8ea4-88b381fe8530"/>
     <xsd:import namespace="5dd3440f-b559-442b-b92f-64cc2a98c0a1"/>
     <xsd:element name="properties">
@@ -2563,7 +1749,7 @@
         <xsd:restriction base="dms:Text"/>
       </xsd:simpleType>
     </xsd:element>
-    <xsd:element name="lcf76f155ced4ddcb4097134ff3c332f" ma:index="13" nillable="true" ma:taxonomy="true" ma:internalName="lcf76f155ced4ddcb4097134ff3c332f" ma:taxonomyFieldName="MediaServiceImageTags" ma:displayName="图像标记" ma:readOnly="false" ma:fieldId="{5cf76f15-5ced-4ddc-b409-7134ff3c332f}" ma:taxonomyMulti="true" ma:sspId="f81c6369-d2bb-455b-92f3-23811b019718" ma:termSetId="09814cd3-568e-fe90-9814-8d621ff8fb84" ma:anchorId="fba54fb3-c3e1-fe81-a776-ca4b69148c4d" ma:open="true" ma:isKeyword="false">
+    <xsd:element name="lcf76f155ced4ddcb4097134ff3c332f" ma:index="13" nillable="true" ma:taxonomy="true" ma:internalName="lcf76f155ced4ddcb4097134ff3c332f" ma:taxonomyFieldName="MediaServiceImageTags" ma:displayName="Image Tags" ma:readOnly="false" ma:fieldId="{5cf76f15-5ced-4ddc-b409-7134ff3c332f}" ma:taxonomyMulti="true" ma:sspId="f81c6369-d2bb-455b-92f3-23811b019718" ma:termSetId="09814cd3-568e-fe90-9814-8d621ff8fb84" ma:anchorId="fba54fb3-c3e1-fe81-a776-ca4b69148c4d" ma:open="true" ma:isKeyword="false">
       <xsd:complexType>
         <xsd:sequence>
           <xsd:element ref="pc:Terms" minOccurs="0" maxOccurs="1"/>
@@ -2617,8 +1803,8 @@
         <xsd:element ref="dc:creator" minOccurs="0" maxOccurs="1"/>
         <xsd:element ref="dcterms:created" minOccurs="0" maxOccurs="1"/>
         <xsd:element ref="dc:identifier" minOccurs="0" maxOccurs="1"/>
-        <xsd:element name="contentType" minOccurs="0" maxOccurs="1" type="xsd:string" ma:index="0" ma:displayName="内容类型"/>
-        <xsd:element ref="dc:title" minOccurs="0" maxOccurs="1" ma:index="4" ma:displayName="标题"/>
+        <xsd:element name="contentType" minOccurs="0" maxOccurs="1" type="xsd:string" ma:index="0" ma:displayName="Content Type"/>
+        <xsd:element ref="dc:title" minOccurs="0" maxOccurs="1" ma:index="4" ma:displayName="Title"/>
         <xsd:element ref="dc:subject" minOccurs="0" maxOccurs="1"/>
         <xsd:element ref="dc:description" minOccurs="0" maxOccurs="1"/>
         <xsd:element name="keywords" minOccurs="0" maxOccurs="1" type="xsd:string"/>
@@ -2708,15 +1894,6 @@
 </file>
 
 <file path=customXml/item2.xml><?xml version="1.0" encoding="utf-8"?>
-<?mso-contentType ?>
-<FormTemplates xmlns="http://schemas.microsoft.com/sharepoint/v3/contenttype/forms">
-  <Display>DocumentLibraryForm</Display>
-  <Edit>DocumentLibraryForm</Edit>
-  <New>DocumentLibraryForm</New>
-</FormTemplates>
-</file>
-
-<file path=customXml/item3.xml><?xml version="1.0" encoding="utf-8"?>
 <p:properties xmlns:p="http://schemas.microsoft.com/office/2006/metadata/properties" xmlns:xsi="http://www.w3.org/2001/XMLSchema-instance" xmlns:pc="http://schemas.microsoft.com/office/infopath/2007/PartnerControls">
   <documentManagement>
     <TaxCatchAll xmlns="5dd3440f-b559-442b-b92f-64cc2a98c0a1" xsi:nil="true"/>
@@ -2727,14 +1904,34 @@
 </p:properties>
 </file>
 
+<file path=customXml/item3.xml><?xml version="1.0" encoding="utf-8"?>
+<?mso-contentType ?>
+<FormTemplates xmlns="http://schemas.microsoft.com/sharepoint/v3/contenttype/forms">
+  <Display>DocumentLibraryForm</Display>
+  <Edit>DocumentLibraryForm</Edit>
+  <New>DocumentLibraryForm</New>
+</FormTemplates>
+</file>
+
 <file path=customXml/itemProps1.xml><?xml version="1.0" encoding="utf-8"?>
-<ds:datastoreItem xmlns:ds="http://schemas.openxmlformats.org/officeDocument/2006/customXml" ds:itemID="{B24B1303-FDF7-4A81-A98E-2F82ECE24C3A}"/>
+<ds:datastoreItem xmlns:ds="http://schemas.openxmlformats.org/officeDocument/2006/customXml" ds:itemID="{D3E44952-8A94-4324-91B4-C5EE6D722E1B}"/>
 </file>
 
 <file path=customXml/itemProps2.xml><?xml version="1.0" encoding="utf-8"?>
-<ds:datastoreItem xmlns:ds="http://schemas.openxmlformats.org/officeDocument/2006/customXml" ds:itemID="{90762580-3E9F-483B-B307-ECCC1FAFE0C0}"/>
+<ds:datastoreItem xmlns:ds="http://schemas.openxmlformats.org/officeDocument/2006/customXml" ds:itemID="{85DE372A-9C91-4D79-97C6-F0CADDEB9F22}">
+  <ds:schemaRefs>
+    <ds:schemaRef ds:uri="http://schemas.microsoft.com/office/2006/metadata/properties"/>
+    <ds:schemaRef ds:uri="http://schemas.microsoft.com/office/infopath/2007/PartnerControls"/>
+    <ds:schemaRef ds:uri="5dd3440f-b559-442b-b92f-64cc2a98c0a1"/>
+    <ds:schemaRef ds:uri="8d121481-1a79-4b27-8ea4-88b381fe8530"/>
+  </ds:schemaRefs>
+</ds:datastoreItem>
 </file>
 
 <file path=customXml/itemProps3.xml><?xml version="1.0" encoding="utf-8"?>
-<ds:datastoreItem xmlns:ds="http://schemas.openxmlformats.org/officeDocument/2006/customXml" ds:itemID="{A67B30C2-EBC3-4063-933E-0F1C68162E36}"/>
+<ds:datastoreItem xmlns:ds="http://schemas.openxmlformats.org/officeDocument/2006/customXml" ds:itemID="{F60C2FA8-13D1-4475-B88F-654895ECBE88}">
+  <ds:schemaRefs>
+    <ds:schemaRef ds:uri="http://schemas.microsoft.com/sharepoint/v3/contenttype/forms"/>
+  </ds:schemaRefs>
+</ds:datastoreItem>
 </file>
</xml_diff>